<commit_message>
Integra las lecturas de Coeckelbergh y Degli-Esposti en el ensayo R2
Co-Authored-By: Claude Sonnet 5.5 <noreply@anthropic.com>
Claude-Session: https://claude.ai/code/session_012HQtHGEWw83YL2w3UxYHZx
</commit_message>
<xml_diff>
--- a/maestria/Navarrete_Arturo_R2_U2.docx
+++ b/maestria/Navarrete_Arturo_R2_U2.docx
@@ -492,7 +492,61 @@
           <w:sz w:val="24"/>
           <w:szCs w:val="24"/>
         </w:rPr>
-        <w:t xml:space="preserve">La IA no puede asumir esa responsabilidad. Según Serafim et al. (2024), solo sigue reglas externas y emula criterios de juicio, sin experiencia moral, y Gzyl (2023) advierte que los generadores de texto no son responsables ni rinden cuentas por lo que producen. El debate sobre si una IA general llegaría a ser sujeto de derechos y deberes (Aguilar Blanc, 2023) es hoy prospectivo; lo que ya existe es la tentación de atribuir a la herramienta lo que corresponde a quien la diseña, la configura o la usa. Por eso la Recomendación de la Organización de las Naciones Unidas para la Educación, la Ciencia y la Cultura (UNESCO, 2022) establece que debe ser siempre posible atribuir la responsabilidad ética y jurídica de los sistemas de IA a personas físicas o a entidades jurídicas existentes, y la Organisation for Economic Co-operation and Development (OECD, 2024) incluye la rendición de cuentas entre sus principios.</w:t>
+        <w:t xml:space="preserve">La IA no puede asumir esa responsabilidad. Coeckelbergh (2021) recuerda, a partir de Aristóteles, que la responsabilidad moral exige dos condiciones: tener control sobre la acción y saber lo que se hace. Las máquinas pueden actuar y decidir, pero carecen de conciencia, de libre albedrío y de capacidad de formar intenciones, por lo que la salida es responsabilizar a las personas de lo que hace la máquina. Es lo que sostienen también Serafim et al. (2024), para quienes la IA solo sigue reglas externas y emula criterios de juicio sin experiencia moral, y Gzyl (2023), al advertir que los generadores de texto no rinden cuentas por lo que producen. El propio Coeckelbergh añade una dificultad: en los sistemas con IA interviene un gran número de personas (programadores, usuarios, empresas) y de componentes técnicos (algoritmos, datos, sensores, </w:t>
+      </w:r>
+      <w:r>
+        <w:rPr>
+          <w:rFonts w:ascii="Arial" w:cs="Arial" w:eastAsia="Arial" w:hAnsi="Arial"/>
+          <w:i/>
+          <w:iCs/>
+          <w:sz w:val="24"/>
+          <w:szCs w:val="24"/>
+        </w:rPr>
+        <w:t xml:space="preserve">software</w:t>
+      </w:r>
+      <w:r>
+        <w:rPr>
+          <w:rFonts w:ascii="Arial" w:cs="Arial" w:eastAsia="Arial" w:hAnsi="Arial"/>
+          <w:sz w:val="24"/>
+          <w:szCs w:val="24"/>
+        </w:rPr>
+        <w:t xml:space="preserve">), lo que él describe como el problema de las </w:t>
+      </w:r>
+      <w:r>
+        <w:rPr>
+          <w:rFonts w:ascii="Arial" w:cs="Arial" w:eastAsia="Arial" w:hAnsi="Arial"/>
+          <w:i/>
+          <w:iCs/>
+          <w:sz w:val="24"/>
+          <w:szCs w:val="24"/>
+        </w:rPr>
+        <w:t xml:space="preserve">muchas manos</w:t>
+      </w:r>
+      <w:r>
+        <w:rPr>
+          <w:rFonts w:ascii="Arial" w:cs="Arial" w:eastAsia="Arial" w:hAnsi="Arial"/>
+          <w:sz w:val="24"/>
+          <w:szCs w:val="24"/>
+        </w:rPr>
+        <w:t xml:space="preserve"> y las </w:t>
+      </w:r>
+      <w:r>
+        <w:rPr>
+          <w:rFonts w:ascii="Arial" w:cs="Arial" w:eastAsia="Arial" w:hAnsi="Arial"/>
+          <w:i/>
+          <w:iCs/>
+          <w:sz w:val="24"/>
+          <w:szCs w:val="24"/>
+        </w:rPr>
+        <w:t xml:space="preserve">muchas cosas</w:t>
+      </w:r>
+      <w:r>
+        <w:rPr>
+          <w:rFonts w:ascii="Arial" w:cs="Arial" w:eastAsia="Arial" w:hAnsi="Arial"/>
+          <w:sz w:val="24"/>
+          <w:szCs w:val="24"/>
+        </w:rPr>
+        <w:t xml:space="preserve">, y por eso no siempre es claro quién responde cuando algo sale mal.</w:t>
       </w:r>
     </w:p>
     <w:p>
@@ -507,7 +561,40 @@
           <w:sz w:val="24"/>
           <w:szCs w:val="24"/>
         </w:rPr>
-        <w:t xml:space="preserve">Mi postura es que la eficiencia es legítima, pero no puede lograrse a costa de diluir la responsabilidad. En el sistema de constancias esto se tradujo en decisiones de diseño concretas: el folio y los datos oficiales se leen de los registros que mantiene Registro Escolar en lugar de calcularse por el sistema; el sistema valida los datos mínimos y rechaza expresamente lo que no puede hacer bien, como las constancias en inglés, para las cuales no existe plantilla; y cada emisión queda en un historial con versión y marca de tiempo. A ello añado un criterio de gestión: quien activa una emisión es una persona identificable y responde por ella.</w:t>
+        <w:t xml:space="preserve">El debate sobre si una IA general llegaría a ser sujeto de derechos y deberes (Aguilar Blanc, 2023) es hoy prospectivo; lo que ya existe es la tentación de atribuir a la herramienta lo que corresponde a quien la diseña, la configura o la usa. Por eso la Recomendación de la Organización de las Naciones Unidas para la Educación, la Ciencia y la Cultura (UNESCO, 2022) establece que debe ser siempre posible atribuir la responsabilidad ética y jurídica de los sistemas de IA a personas físicas o a entidades jurídicas existentes, y la Organisation for Economic Co-operation and Development (OECD, 2024) incluye la rendición de cuentas entre sus principios. Degli-Esposti (2023) coincide: el desarrollo ético de la IA es facultad y responsabilidad de todos los actores involucrados, desde quienes la diseñan hasta quienes la usan, y la rendición de cuentas figura entre los siete requisitos de una IA confiable, con mecanismos para identificar responsabilidades y auditar los sistemas.</w:t>
+      </w:r>
+    </w:p>
+    <w:p>
+      <w:pPr>
+        <w:spacing w:after="0" w:before="0" w:line="360" w:lineRule="auto"/>
+        <w:ind w:firstLine="720"/>
+        <w:jc w:val="both"/>
+      </w:pPr>
+      <w:r>
+        <w:rPr>
+          <w:rFonts w:ascii="Arial" w:cs="Arial" w:eastAsia="Arial" w:hAnsi="Arial"/>
+          <w:sz w:val="24"/>
+          <w:szCs w:val="24"/>
+        </w:rPr>
+        <w:t xml:space="preserve">Mi postura es que la eficiencia es legítima, pero no puede lograrse a costa de diluir la responsabilidad. En el sistema de constancias intervienen quien captura los datos académicos, quien desarrolla el sistema —con apoyo de un asistente de IA—, quien activa la emisión y la institución que firma el documento: son las </w:t>
+      </w:r>
+      <w:r>
+        <w:rPr>
+          <w:rFonts w:ascii="Arial" w:cs="Arial" w:eastAsia="Arial" w:hAnsi="Arial"/>
+          <w:i/>
+          <w:iCs/>
+          <w:sz w:val="24"/>
+          <w:szCs w:val="24"/>
+        </w:rPr>
+        <w:t xml:space="preserve">muchas manos</w:t>
+      </w:r>
+      <w:r>
+        <w:rPr>
+          <w:rFonts w:ascii="Arial" w:cs="Arial" w:eastAsia="Arial" w:hAnsi="Arial"/>
+          <w:sz w:val="24"/>
+          <w:szCs w:val="24"/>
+        </w:rPr>
+        <w:t xml:space="preserve"> de las que habla Coeckelbergh (2021). Mi respuesta se tradujo en decisiones de diseño concretas: el folio y los datos oficiales se leen de los registros que mantiene Registro Escolar en lugar de calcularse por el sistema; el sistema valida los datos mínimos y rechaza expresamente lo que no puede hacer bien, como las constancias en inglés, para las cuales no existe plantilla; y cada emisión queda en un historial con versión y marca de tiempo. A ello añado un criterio de gestión: quien activa una emisión es una persona identificable y responde por ella.</w:t>
       </w:r>
     </w:p>
     <w:p>
@@ -556,7 +643,7 @@
           <w:sz w:val="24"/>
           <w:szCs w:val="24"/>
         </w:rPr>
-        <w:t xml:space="preserve">Los sistemas que desarrollo se apoyan, además, en servicios de terceros (hojas de cálculo y almacenamiento en la nube, correo transaccional, alojamiento) y, durante su desarrollo, en asistentes de IA generativa. El dilema está entre la comodidad de usar la herramienta más capaz y el deber de proteger lo que las personas confiaron a la institución. Hay dos riesgos distintos. El primero es la exposición: Carlini et al. (2021) demostraron que es posible extraer fragmentos textuales de los datos de entrenamiento de un modelo de lenguaje, incluidos nombres, teléfonos y correos electrónicos, por lo que conviene suponer que lo que se entrega a una herramienta externa podría salir de la institución si el proveedor lo usa para entrenar sus modelos. El segundo es el normativo: la Ley Federal de Protección de Datos Personales en Posesión de los Particulares, que en 2025 sustituyó a la de 2010, exige informar al titular mediante un aviso de privacidad y tratar sus datos de forma legítima (Cámara de Diputados del Honorable Congreso de la Unión [CDHCU], 2025). Aunque el CIESS, como organismo internacional, cuenta con su propio régimen, la tomo como referencia mínima, junto con el principio de privacidad y protección de datos de la UNESCO (2022).</w:t>
+        <w:t xml:space="preserve">Los sistemas que desarrollo se apoyan, además, en servicios de terceros (hojas de cálculo y almacenamiento en la nube, correo transaccional, alojamiento) y, durante su desarrollo, en asistentes de IA generativa. El dilema está entre la comodidad de usar la herramienta más capaz y el deber de proteger lo que las personas confiaron a la institución. Hay dos riesgos distintos. El primero es la exposición: Carlini et al. (2021) demostraron que es posible extraer fragmentos textuales de los datos de entrenamiento de un modelo de lenguaje, incluidos nombres, teléfonos y correos electrónicos, por lo que conviene suponer que lo que se entrega a una herramienta externa podría salir de la institución si el proveedor lo usa para entrenar sus modelos. El segundo es el normativo: la Ley Federal de Protección de Datos Personales en Posesión de los Particulares, que en 2025 sustituyó a la de 2010, exige informar al titular mediante un aviso de privacidad y tratar sus datos de forma legítima (Cámara de Diputados del Honorable Congreso de la Unión [CDHCU], 2025). Aunque el CIESS, como organismo internacional, cuenta con su propio régimen, la tomo como referencia mínima, junto con el principio de privacidad y protección de datos de la UNESCO (2022). Degli-Esposti (2023) recuerda, además, que el buen gobierno de los datos implica preservar la relación de confianza entre quienes ceden los datos y quienes los procesan.</w:t>
       </w:r>
     </w:p>
     <w:p>
@@ -605,7 +692,7 @@
           <w:sz w:val="24"/>
           <w:szCs w:val="24"/>
         </w:rPr>
-        <w:t xml:space="preserve">Una constancia o un acta tienen valor porque se confía en su autenticidad. Por eso cada constancia lleva un código QR que apunta al archivo publicado, el sistema comprueba que la dirección responda antes de darla por emitida y la versión anterior se archiva cuando se corrige un dato. Esa trazabilidad se acerca a lo que Floridi et al. (2018) llaman explicabilidad: no solo entender cómo funciona un sistema, sino saber quién responde por él. La UNESCO (2022) y la OECD (2024) también exigen transparencia y explicabilidad, y el CIESS reconoce la integridad y la transparencia entre sus valores (CIESS, s. f.-d).</w:t>
+        <w:t xml:space="preserve">Una constancia o un acta tienen valor porque se confía en su autenticidad. Por eso cada constancia lleva un código QR que apunta al archivo publicado, el sistema comprueba que la dirección responda antes de darla por emitida y la versión anterior se archiva cuando se corrige un dato. Esa trazabilidad se acerca a lo que Floridi et al. (2018) llaman explicabilidad: no solo entender cómo funciona un sistema, sino saber quién responde por él. Coeckelbergh (2021) precisa que explicar no implica necesariamente revelar el código, sino poder explicar las decisiones ante quien resulta afectado por ellas. Eso busca el historial de emisiones: poder decir por qué se emitió un documento, quién lo activó, con qué datos y cuándo. La UNESCO (2022) y la OECD (2024) también exigen transparencia y explicabilidad, y el CIESS reconoce la integridad y la transparencia entre sus valores (CIESS, s. f.-d).</w:t>
       </w:r>
     </w:p>
     <w:p>
@@ -620,7 +707,7 @@
           <w:sz w:val="24"/>
           <w:szCs w:val="24"/>
         </w:rPr>
-        <w:t xml:space="preserve">La transparencia tiene también una dimensión personal: declarar cuándo se usó IA. Los sistemas descritos se construyeron con asistentes de IA generativa, y considero que debe quedar documentado qué generó la herramienta, qué revisó y probó una persona y con qué criterios, de la misma manera en que se citan las fuentes en un trabajo académico. Ocultar el uso de IA no es un problema técnico, sino de honestidad, y erosiona la confianza en documentos que valen precisamente por esa confianza.</w:t>
+        <w:t xml:space="preserve">La transparencia tiene también una dimensión personal: declarar cuándo se usó IA. Degli-Esposti (2023) recoge como requisito de una IA confiable que “los usuarios y operadores deben ser conscientes de que están interactuando con un sistema de IA y deben conocer las capacidades y limitaciones del mismo” (p. 42), lo que aplica tanto a un asistente virtual de atención como a mis propios sistemas. Los sistemas descritos se construyeron con asistentes de IA generativa, y considero que debe quedar documentado qué generó la herramienta, qué revisó y probó una persona y con qué criterios, de la misma manera en que se citan las fuentes en un trabajo académico. Ocultar el uso de IA no es un problema técnico, sino de honestidad, y erosiona la confianza en documentos que valen precisamente por esa confianza.</w:t>
       </w:r>
     </w:p>
     <w:p>
@@ -732,7 +819,7 @@
           <w:sz w:val="24"/>
           <w:szCs w:val="24"/>
         </w:rPr>
-        <w:t xml:space="preserve"> Siempre habrá una persona identificable que responda por el resultado (UNESCO, 2022).</w:t>
+        <w:t xml:space="preserve"> Siempre habrá una persona identificable que responda por el resultado (Coeckelbergh, 2021; UNESCO, 2022).</w:t>
       </w:r>
     </w:p>
     <w:p>
@@ -761,7 +848,7 @@
           <w:sz w:val="24"/>
           <w:szCs w:val="24"/>
         </w:rPr>
-        <w:t xml:space="preserve"> Probar en una copia antes de pasar a producción y verificar una muestra antes de cada emisión masiva, para contrarrestar la complacencia (Parasuraman &amp; Manzey, 2010).</w:t>
+        <w:t xml:space="preserve"> Probar en una copia antes de pasar a producción y verificar una muestra antes de cada emisión masiva, de modo que la persona conserve la capacidad de cuestionar lo que produce el sistema y se contrarreste la complacencia (Degli-Esposti, 2023; Parasuraman &amp; Manzey, 2010).</w:t>
       </w:r>
     </w:p>
     <w:p>
@@ -819,7 +906,7 @@
           <w:sz w:val="24"/>
           <w:szCs w:val="24"/>
         </w:rPr>
-        <w:t xml:space="preserve"> Conservar el historial de emisiones y versiones, y una bitácora de dónde se usó IA en el desarrollo.</w:t>
+        <w:t xml:space="preserve"> Conservar el historial de emisiones y versiones, y una bitácora de dónde se usó IA en el desarrollo, además de auditar periódicamente los resultados (Degli-Esposti, 2023).</w:t>
       </w:r>
     </w:p>
     <w:p>
@@ -882,7 +969,7 @@
           <w:sz w:val="24"/>
           <w:szCs w:val="24"/>
         </w:rPr>
-        <w:t xml:space="preserve">La IA y la ciencia de datos ofrecen al CIESS una oportunidad real de atender a más personas con mayor calidad, pero no modifican una verdad básica: la herramienta no es un agente moral, y quien la diseña, la configura y la usa conserva la responsabilidad de sus resultados (Serafim et al., 2024). Mi experiencia desarrollando estos sistemas me enseñó que los riesgos más serios surgen al confiar en la tecnología sin verificarla, al compartir datos sin medir las consecuencias y al no dejar rastro de lo que se hizo. Por eso la ética no frena la innovación: es lo que permite que documentos como las constancias y las actas sigan valiendo. Una institución que enseña a otras a usar la IA de forma responsable tiene la oportunidad, y la obligación, de ser la primera en practicarlo.</w:t>
+        <w:t xml:space="preserve">La IA y la ciencia de datos ofrecen al CIESS una oportunidad real de atender a más personas con mayor calidad, pero no modifican una verdad básica: la herramienta no es un agente moral, y quien la diseña, la configura y la usa conserva la responsabilidad de sus resultados (Coeckelbergh, 2021; Serafim et al., 2024). Quienes diseñamos, desarrollamos y usamos estos sistemas estamos, como señala Degli-Esposti (2023), en la primera línea de la ética de la IA. Mi experiencia desarrollando estos sistemas me enseñó que los riesgos más serios surgen al confiar en la tecnología sin verificarla, al compartir datos sin medir las consecuencias y al no dejar rastro de lo que se hizo. Por eso la ética no frena la innovación: es lo que permite que documentos como las constancias y las actas sigan valiendo. Una institución que enseña a otras a usar la IA de forma responsable tiene la oportunidad, y la obligación, de ser la primera en practicarlo.</w:t>
       </w:r>
     </w:p>
     <w:p>
@@ -1403,7 +1490,7 @@
         </w:rPr>
         <w:t xml:space="preserve">. Diario Oficial de la Federación. </w:t>
       </w:r>
-      <w:hyperlink w:history="1" r:id="rIdtwyx17uh3fky3vne2drw1">
+      <w:hyperlink w:history="1" r:id="rId1dothru495p_cu5oz-vxc">
         <w:r>
           <w:rPr>
             <w:rStyle w:val="Hyperlink"/>
@@ -1447,7 +1534,7 @@
         </w:rPr>
         <w:t xml:space="preserve"> (pp. 2633-2650). USENIX Association. </w:t>
       </w:r>
-      <w:hyperlink w:history="1" r:id="rIdivqcuwnpj3mo_dwldgmit">
+      <w:hyperlink w:history="1" r:id="rIdvrz-gso8lsiu1azfg8a6q">
         <w:r>
           <w:rPr>
             <w:rStyle w:val="Hyperlink"/>
@@ -1491,7 +1578,7 @@
         </w:rPr>
         <w:t xml:space="preserve">. </w:t>
       </w:r>
-      <w:hyperlink w:history="1" r:id="rId4fdveuzuoooxdr1yvk4y-">
+      <w:hyperlink w:history="1" r:id="rIdfin80t8drhn2rrhw7fpf6">
         <w:r>
           <w:rPr>
             <w:rStyle w:val="Hyperlink"/>
@@ -1535,7 +1622,7 @@
         </w:rPr>
         <w:t xml:space="preserve">. </w:t>
       </w:r>
-      <w:hyperlink w:history="1" r:id="rIdu9v5wgtkirljqpxtmkig-">
+      <w:hyperlink w:history="1" r:id="rIdmuyv9hzjpanfuzvjgfpkb">
         <w:r>
           <w:rPr>
             <w:rStyle w:val="Hyperlink"/>
@@ -1579,7 +1666,7 @@
         </w:rPr>
         <w:t xml:space="preserve">. </w:t>
       </w:r>
-      <w:hyperlink w:history="1" r:id="rIdcwe15-7nl6ovpcswgpvda">
+      <w:hyperlink w:history="1" r:id="rIdrixr9kubm_st3ls-1nu3f">
         <w:r>
           <w:rPr>
             <w:rStyle w:val="Hyperlink"/>
@@ -1623,7 +1710,7 @@
         </w:rPr>
         <w:t xml:space="preserve">. </w:t>
       </w:r>
-      <w:hyperlink w:history="1" r:id="rIdj2ppkivqpft0he-exnasu">
+      <w:hyperlink w:history="1" r:id="rIdwnrltksvngon7yyuhhgnp">
         <w:r>
           <w:rPr>
             <w:rStyle w:val="Hyperlink"/>
@@ -1647,6 +1734,72 @@
           <w:sz w:val="24"/>
           <w:szCs w:val="24"/>
         </w:rPr>
+        <w:t xml:space="preserve">Coeckelbergh, M. (2021). </w:t>
+      </w:r>
+      <w:r>
+        <w:rPr>
+          <w:rFonts w:ascii="Arial" w:cs="Arial" w:eastAsia="Arial" w:hAnsi="Arial"/>
+          <w:i/>
+          <w:iCs/>
+          <w:sz w:val="24"/>
+          <w:szCs w:val="24"/>
+        </w:rPr>
+        <w:t xml:space="preserve">Ética de la inteligencia artificial</w:t>
+      </w:r>
+      <w:r>
+        <w:rPr>
+          <w:rFonts w:ascii="Arial" w:cs="Arial" w:eastAsia="Arial" w:hAnsi="Arial"/>
+          <w:sz w:val="24"/>
+          <w:szCs w:val="24"/>
+        </w:rPr>
+        <w:t xml:space="preserve">. Ediciones Cátedra. Recuperado de la base de datos elibrocatedra.</w:t>
+      </w:r>
+    </w:p>
+    <w:p>
+      <w:pPr>
+        <w:spacing w:after="0" w:before="0" w:line="360" w:lineRule="auto"/>
+        <w:ind w:left="720" w:hanging="720"/>
+        <w:jc w:val="left"/>
+      </w:pPr>
+      <w:r>
+        <w:rPr>
+          <w:rFonts w:ascii="Arial" w:cs="Arial" w:eastAsia="Arial" w:hAnsi="Arial"/>
+          <w:sz w:val="24"/>
+          <w:szCs w:val="24"/>
+        </w:rPr>
+        <w:t xml:space="preserve">Degli-Esposti, S. (2023). </w:t>
+      </w:r>
+      <w:r>
+        <w:rPr>
+          <w:rFonts w:ascii="Arial" w:cs="Arial" w:eastAsia="Arial" w:hAnsi="Arial"/>
+          <w:i/>
+          <w:iCs/>
+          <w:sz w:val="24"/>
+          <w:szCs w:val="24"/>
+        </w:rPr>
+        <w:t xml:space="preserve">La ética de la inteligencia artificial</w:t>
+      </w:r>
+      <w:r>
+        <w:rPr>
+          <w:rFonts w:ascii="Arial" w:cs="Arial" w:eastAsia="Arial" w:hAnsi="Arial"/>
+          <w:sz w:val="24"/>
+          <w:szCs w:val="24"/>
+        </w:rPr>
+        <w:t xml:space="preserve">. Editorial CSIC Consejo Superior de Investigaciones Científicas. Recuperado de la base de datos elibrocatedra.</w:t>
+      </w:r>
+    </w:p>
+    <w:p>
+      <w:pPr>
+        <w:spacing w:after="0" w:before="0" w:line="360" w:lineRule="auto"/>
+        <w:ind w:left="720" w:hanging="720"/>
+        <w:jc w:val="left"/>
+      </w:pPr>
+      <w:r>
+        <w:rPr>
+          <w:rFonts w:ascii="Arial" w:cs="Arial" w:eastAsia="Arial" w:hAnsi="Arial"/>
+          <w:sz w:val="24"/>
+          <w:szCs w:val="24"/>
+        </w:rPr>
         <w:t xml:space="preserve">Elish, M. C. (2019). Moral crumple zones: Cautionary tales in human-robot interaction. </w:t>
       </w:r>
       <w:r>
@@ -1667,7 +1820,7 @@
         </w:rPr>
         <w:t xml:space="preserve">, 40-60. </w:t>
       </w:r>
-      <w:hyperlink w:history="1" r:id="rIdtksscykpsqv5f6lfnscyt">
+      <w:hyperlink w:history="1" r:id="rIdjcncqjvfdecsx4ahvfmr5">
         <w:r>
           <w:rPr>
             <w:rStyle w:val="Hyperlink"/>
@@ -1711,7 +1864,7 @@
         </w:rPr>
         <w:t xml:space="preserve">(4), 689-707. </w:t>
       </w:r>
-      <w:hyperlink w:history="1" r:id="rIdrxhs3nnuszsyhrzvqrsn0">
+      <w:hyperlink w:history="1" r:id="rId8oneikvnqmlbdsxtlxdqh">
         <w:r>
           <w:rPr>
             <w:rStyle w:val="Hyperlink"/>
@@ -1755,7 +1908,7 @@
         </w:rPr>
         <w:t xml:space="preserve"> (ILO Working Paper 96). International Labour Organization. </w:t>
       </w:r>
-      <w:hyperlink w:history="1" r:id="rIdhtvsmrrnflqqwboz2q2-z">
+      <w:hyperlink w:history="1" r:id="rIdewoaosdiwrssjx2sp9mhp">
         <w:r>
           <w:rPr>
             <w:rStyle w:val="Hyperlink"/>
@@ -1832,7 +1985,7 @@
         </w:rPr>
         <w:t xml:space="preserve"> (OECD/LEGAL/0449). OECD Legal Instruments. </w:t>
       </w:r>
-      <w:hyperlink w:history="1" r:id="rIdprmaeklmbshd9_q0rmaqf">
+      <w:hyperlink w:history="1" r:id="rIdf-18mgahgmo7prnz2covb">
         <w:r>
           <w:rPr>
             <w:rStyle w:val="Hyperlink"/>
@@ -1876,7 +2029,7 @@
         </w:rPr>
         <w:t xml:space="preserve"> (SHS/BIO/PI/2021/1). </w:t>
       </w:r>
-      <w:hyperlink w:history="1" r:id="rIdxyythqhvysr9gf381_cx-">
+      <w:hyperlink w:history="1" r:id="rIddkhoti7bzxjhaqpcb1kfr">
         <w:r>
           <w:rPr>
             <w:rStyle w:val="Hyperlink"/>
@@ -1920,7 +2073,7 @@
         </w:rPr>
         <w:t xml:space="preserve">(3), 381-410. </w:t>
       </w:r>
-      <w:hyperlink w:history="1" r:id="rId0lk1v0g61sd-qqhzwxw26">
+      <w:hyperlink w:history="1" r:id="rIdfyhtda5t9hhnorkmq3ml3">
         <w:r>
           <w:rPr>
             <w:rStyle w:val="Hyperlink"/>

</xml_diff>

<commit_message>
Ensayo R2: ajustes a la rúbrica (declaratoria, ciencia de datos, formato UVEG) y foro con referencias al estilo UVEG
Co-Authored-By: Claude Sonnet 5.5 <noreply@anthropic.com>
Claude-Session: https://claude.ai/code/session_012HQtHGEWw83YL2w3UxYHZx
</commit_message>
<xml_diff>
--- a/maestria/Navarrete_Arturo_R2_U2.docx
+++ b/maestria/Navarrete_Arturo_R2_U2.docx
@@ -102,7 +102,7 @@
           <w:sz w:val="24"/>
           <w:szCs w:val="24"/>
         </w:rPr>
-        <w:t xml:space="preserve">Entre la eficiencia y la responsabilidad: dilemas éticos del uso de la inteligencia artificial en los procesos académicos del CIESS</w:t>
+        <w:t xml:space="preserve">Entre la eficiencia y la responsabilidad: dilemas éticos de la ciencia de datos y la inteligencia artificial en los procesos académicos del CIESS</w:t>
       </w:r>
     </w:p>
     <w:p>
@@ -240,7 +240,7 @@
           <w:sz w:val="24"/>
           <w:szCs w:val="24"/>
         </w:rPr>
-        <w:t xml:space="preserve"> se adjunta el formato firmado</w:t>
+        <w:t xml:space="preserve"> se anexa en la página siguiente</w:t>
       </w:r>
     </w:p>
     <w:p>
@@ -260,13 +260,97 @@
           <w:sz w:val="24"/>
           <w:szCs w:val="24"/>
         </w:rPr>
-        <w:t xml:space="preserve">Entre la eficiencia y la responsabilidad: dilemas éticos del uso de la inteligencia artificial en los procesos académicos del CIESS</w:t>
-      </w:r>
-    </w:p>
+        <w:t xml:space="preserve">Declaratoria de originalidad</w:t>
+      </w:r>
+    </w:p>
+    <w:p>
+      <w:pPr>
+        <w:spacing w:after="0" w:before="0" w:line="360" w:lineRule="auto"/>
+        <w:ind w:firstLine="720"/>
+        <w:jc w:val="both"/>
+      </w:pPr>
+      <w:r>
+        <w:rPr>
+          <w:rFonts w:ascii="Arial" w:cs="Arial" w:eastAsia="Arial" w:hAnsi="Arial"/>
+          <w:sz w:val="24"/>
+          <w:szCs w:val="24"/>
+        </w:rPr>
+        <w:t xml:space="preserve">Se anexa el formato de declaratoria de originalidad, firmado y escaneado.</w:t>
+      </w:r>
+    </w:p>
+    <w:tbl>
+      <w:tblPr>
+        <w:tblW w:type="dxa" w:w="8838"/>
+        <w:tblBorders>
+          <w:top w:val="single" w:color="auto" w:sz="4"/>
+          <w:left w:val="single" w:color="auto" w:sz="4"/>
+          <w:bottom w:val="single" w:color="auto" w:sz="4"/>
+          <w:right w:val="single" w:color="auto" w:sz="4"/>
+          <w:insideH w:val="single" w:color="auto" w:sz="4"/>
+          <w:insideV w:val="single" w:color="auto" w:sz="4"/>
+        </w:tblBorders>
+      </w:tblPr>
+      <w:tblGrid>
+        <w:gridCol w:w="8838"/>
+      </w:tblGrid>
+      <w:tr>
+        <w:trPr>
+          <w:cantSplit/>
+          <w:trHeight w:val="10500" w:hRule="exact"/>
+        </w:trPr>
+        <w:tc>
+          <w:tcPr>
+            <w:tcW w:type="dxa" w:w="8838"/>
+            <w:tcBorders>
+              <w:top w:val="dashed" w:color="808080" w:sz="6"/>
+              <w:left w:val="dashed" w:color="808080" w:sz="6"/>
+              <w:bottom w:val="dashed" w:color="808080" w:sz="6"/>
+              <w:right w:val="dashed" w:color="808080" w:sz="6"/>
+            </w:tcBorders>
+            <w:vAlign w:val="center"/>
+          </w:tcPr>
+          <w:p>
+            <w:pPr>
+              <w:spacing w:after="0" w:before="0" w:line="360" w:lineRule="auto"/>
+              <w:jc w:val="center"/>
+            </w:pPr>
+            <w:r>
+              <w:rPr>
+                <w:rFonts w:ascii="Arial" w:cs="Arial" w:eastAsia="Arial" w:hAnsi="Arial"/>
+                <w:sz w:val="24"/>
+                <w:szCs w:val="24"/>
+                <w:shd w:fill="FFFF00" w:color="auto" w:val="clear"/>
+              </w:rPr>
+              <w:t xml:space="preserve">[Insertar aquí la declaratoria de originalidad firmada y escaneada]</w:t>
+            </w:r>
+          </w:p>
+        </w:tc>
+      </w:tr>
+    </w:tbl>
     <w:p>
       <w:pPr>
         <w:pStyle w:val="Heading1"/>
         <w:keepNext/>
+        <w:pageBreakBefore/>
+        <w:spacing w:after="0" w:before="0" w:line="360" w:lineRule="auto"/>
+        <w:jc w:val="center"/>
+      </w:pPr>
+      <w:r>
+        <w:rPr>
+          <w:rFonts w:ascii="Arial" w:cs="Arial" w:eastAsia="Arial" w:hAnsi="Arial"/>
+          <w:b/>
+          <w:bCs/>
+          <w:color w:val="000000"/>
+          <w:sz w:val="24"/>
+          <w:szCs w:val="24"/>
+        </w:rPr>
+        <w:t xml:space="preserve">Entre la eficiencia y la responsabilidad: dilemas éticos de la ciencia de datos y la inteligencia artificial en los procesos académicos del CIESS</w:t>
+      </w:r>
+    </w:p>
+    <w:p>
+      <w:pPr>
+        <w:pStyle w:val="Heading1"/>
+        <w:keepNext/>
         <w:spacing w:after="0" w:before="0" w:line="360" w:lineRule="auto"/>
         <w:jc w:val="center"/>
       </w:pPr>
@@ -294,7 +378,7 @@
           <w:sz w:val="24"/>
           <w:szCs w:val="24"/>
         </w:rPr>
-        <w:t xml:space="preserve">El Centro Interamericano de Estudios de Seguridad Social (CIESS, s. f.-d) es el órgano de docencia, capacitación e investigación de la Conferencia Interamericana de Seguridad Social (CISS), un organismo internacional, técnico y sin fines de lucro que integra a más de 80 instituciones de 36 países. Laboro en esta institución, donde desarrollo y mantengo herramientas digitales que apoyan su operación académica: un sistema que automatiza la emisión de constancias, un sistema de registro para un congreso internacional y un complemento (</w:t>
+        <w:t xml:space="preserve">El Centro Interamericano de Estudios de Seguridad Social (CIESS, s.f.-d) es el órgano de docencia, capacitación e investigación de la Conferencia Interamericana de Seguridad Social (CISS), un organismo internacional, técnico y sin fines de lucro que integra a más de 80 instituciones de 36 países. Laboro en esta institución, donde desarrollo y mantengo herramientas digitales que apoyan su operación académica: un sistema que automatiza la emisión de constancias, un sistema de registro con panel de análisis de datos para un congreso internacional y un complemento (</w:t>
       </w:r>
       <w:r>
         <w:rPr>
@@ -327,7 +411,7 @@
           <w:sz w:val="24"/>
           <w:szCs w:val="24"/>
         </w:rPr>
-        <w:t xml:space="preserve">En este contexto identifico cuatro dilemas éticos principales. El primero es el de la responsabilidad: cuando una tarea se automatiza, ¿quién responde por un error que se replica a escala? El segundo es el de la confidencialidad: ¿qué datos personales o institucionales pueden confiarse a plataformas y asistentes externos? El tercero es el de la transparencia: ¿cómo se deja constancia de qué hizo la máquina y qué hizo una persona? El cuarto es el del efecto sobre el trabajo del personal administrativo, que es el más expuesto a estas tecnologías.</w:t>
+        <w:t xml:space="preserve">En este contexto identifico cuatro dilemas éticos principales en la aplicación de la ciencia de datos y la IA. El primero es el de la responsabilidad: cuando una tarea se automatiza, ¿quién responde por un error que se replica a escala? El segundo es el de la confidencialidad: ¿qué datos personales o institucionales pueden confiarse a plataformas y asistentes externos? El tercero es el de la transparencia: ¿cómo se deja constancia de qué hizo la máquina y qué hizo una persona? El cuarto es el del efecto sobre el trabajo del personal administrativo, que es el más expuesto a estas tecnologías.</w:t>
       </w:r>
     </w:p>
     <w:p>
@@ -368,7 +452,7 @@
       <w:pPr>
         <w:pStyle w:val="Heading2"/>
         <w:keepNext/>
-        <w:spacing w:after="0" w:before="120" w:line="360" w:lineRule="auto"/>
+        <w:spacing w:after="0" w:before="0" w:line="360" w:lineRule="auto"/>
         <w:jc w:val="left"/>
       </w:pPr>
       <w:r>
@@ -395,7 +479,7 @@
           <w:sz w:val="24"/>
           <w:szCs w:val="24"/>
         </w:rPr>
-        <w:t xml:space="preserve">El CIESS ofrece cursos, diplomados, seminarios, talleres y microaprendizajes con apoyo de su campus virtual. Cada actividad genera datos de inscripción, acreditación y calificaciones, así como documentos con valor curricular para quien los recibe. Mi trabajo consiste en reducir la carga manual de esos procesos. El sistema de constancias sustituyó un procedimiento de siete pasos manuales —entre ellos la composición en software de diseño, la generación del código QR y la publicación por FTP— por un flujo que se dispara desde una casilla de la base de datos académica: el sistema compone el documento, genera el QR, lo publica, verifica que la dirección responda y registra la emisión en un historial. El sistema de registro del congreso incluye un formulario trilingüe, un panel de estadísticas, el dictamen de ponencias y el consentimiento informado de cada participante. El complemento del campus virtual permite que el personal docente genere las actas de calificaciones sin salir de la plataforma ni descargar y volver a cargar archivos CSV.</w:t>
+        <w:t xml:space="preserve">El CIESS ofrece cursos, diplomados, seminarios, talleres y microaprendizajes con apoyo de su campus virtual. Cada actividad genera datos de inscripción, acreditación y calificaciones, así como documentos con valor curricular para quien los recibe. Mi trabajo consiste en reducir la carga manual de esos procesos. El sistema de constancias sustituyó un procedimiento de siete pasos manuales —entre ellos la composición en software de diseño, la generación del código QR y la publicación por FTP— por un flujo que se dispara desde una casilla de la base de datos académica: el sistema compone el documento, genera el QR, lo publica, verifica que la dirección responda y registra la emisión en un historial. El sistema de registro del congreso incluye un formulario trilingüe, un panel de análisis de datos (tableros, mapas y una proyección de inscripciones mediante regresión lineal simple), el dictamen de ponencias y el consentimiento informado de cada participante. El complemento del campus virtual permite que el personal docente genere las actas de calificaciones sin salir de la plataforma ni descargar y volver a cargar archivos CSV.</w:t>
       </w:r>
     </w:p>
     <w:p>
@@ -410,14 +494,14 @@
           <w:sz w:val="24"/>
           <w:szCs w:val="24"/>
         </w:rPr>
-        <w:t xml:space="preserve">Conviene precisar que el motor de constancias es automatización basada en reglas y no aprendizaje automático. Aun así, enfrenta los mismos dilemas que un sistema de IA, porque delega en una máquina una tarea con consecuencias para personas reales, y se desarrolló con asistentes de IA generativa. Además, el CIESS imparte un microaprendizaje dirigido al personal administrativo y técnico de instituciones de seguridad social para usar de forma efectiva y responsable asistentes de IA generativa, con un módulo sobre uso responsable, ética y privacidad (CIESS, s. f.-c). Esto plantea una exigencia de coherencia: una institución que forma a otros en el uso responsable de la IA debe practicarlo en su propia operación, en línea con sus valores de integridad y transparencia (CIESS, s. f.-d).</w:t>
+        <w:t xml:space="preserve">Conviene precisar que el motor de constancias es automatización basada en reglas y no aprendizaje automático. Aun así, enfrenta los mismos dilemas que un sistema de IA, porque delega en una máquina una tarea con consecuencias para personas reales, y se desarrolló con asistentes de IA generativa. Por otra parte, el CIESS imparte un microaprendizaje dirigido al personal administrativo y técnico de instituciones de seguridad social para usar de forma efectiva y responsable asistentes de IA generativa, con un módulo sobre uso responsable, ética y privacidad (CIESS, s.f.-c). Esto plantea una exigencia de coherencia: una institución que forma a otros en el uso responsable de la IA debe practicarlo en su propia operación, en línea con sus valores de integridad y transparencia (CIESS, s.f.-d).</w:t>
       </w:r>
     </w:p>
     <w:p>
       <w:pPr>
         <w:pStyle w:val="Heading2"/>
         <w:keepNext/>
-        <w:spacing w:after="0" w:before="120" w:line="360" w:lineRule="auto"/>
+        <w:spacing w:after="0" w:before="0" w:line="360" w:lineRule="auto"/>
         <w:jc w:val="left"/>
       </w:pPr>
       <w:r>
@@ -444,7 +528,7 @@
           <w:sz w:val="24"/>
           <w:szCs w:val="24"/>
         </w:rPr>
-        <w:t xml:space="preserve">Automatizar multiplica la capacidad, pero también multiplica el error. Un descuido al elaborar una constancia a mano afecta a una persona; el mismo descuido en un sistema que emite decenas de documentos con un clic afecta a todas. Lo viví a pequeña escala: al probar el sistema en una copia de la base de datos antes de conectarlo a la real, detectamos que las fechas llegaban en un formato distinto al esperado y que el cálculo del periodo habría publicado las constancias en una ruta inexistente. Lo detectó una persona que revisó el resultado, no la máquina.</w:t>
+        <w:t xml:space="preserve">Automatizar multiplica la capacidad, pero también multiplica el error. Un descuido al elaborar una constancia a mano afecta a una persona; el mismo descuido en un sistema que emite decenas de documentos con un clic afecta a todas. Lo viví a pequeña escala: al probar el sistema en una copia de la base de datos antes de conectarlo a la real, detecté que las fechas llegaban en un formato distinto al esperado y que el cálculo del periodo habría publicado las constancias en una ruta inexistente. Lo detecté al revisar el resultado, no porque la máquina lo señalara.</w:t>
       </w:r>
     </w:p>
     <w:p>
@@ -492,7 +576,7 @@
           <w:sz w:val="24"/>
           <w:szCs w:val="24"/>
         </w:rPr>
-        <w:t xml:space="preserve">La IA no puede asumir esa responsabilidad. Coeckelbergh (2021) recuerda, a partir de Aristóteles, que la responsabilidad moral exige dos condiciones: tener control sobre la acción y saber lo que se hace. Las máquinas pueden actuar y decidir, pero carecen de conciencia, de libre albedrío y de capacidad de formar intenciones, por lo que la salida es responsabilizar a las personas de lo que hace la máquina. Es lo que sostienen también Serafim et al. (2024), para quienes la IA solo sigue reglas externas y emula criterios de juicio sin experiencia moral, y Gzyl (2023), al advertir que los generadores de texto no rinden cuentas por lo que producen. El propio Coeckelbergh añade una dificultad: en los sistemas con IA interviene un gran número de personas (programadores, usuarios, empresas) y de componentes técnicos (algoritmos, datos, sensores, </w:t>
+        <w:t xml:space="preserve">La IA no puede asumir esa responsabilidad. Coeckelbergh (2021) recuerda, a partir de Aristóteles, que la responsabilidad moral exige dos condiciones: tener control sobre la acción y saber lo que se hace. Las máquinas pueden actuar y decidir, pero carecen de conciencia, de libre albedrío y de capacidad de formar intenciones, por lo que la salida es responsabilizar a las personas de lo que hace la máquina. Serafim et al. (2024) llegan a una conclusión semejante: la IA solo sigue reglas externas y emula criterios de juicio, sin experiencia moral. Gzyl (2023), por su parte, advierte que los generadores de texto no rinden cuentas por lo que producen. El propio Coeckelbergh añade una dificultad: en los sistemas con IA intervienen muchas personas (programadores, usuarios, empresas) y muchos componentes técnicos (algoritmos, datos, sensores, </w:t>
       </w:r>
       <w:r>
         <w:rPr>
@@ -510,7 +594,7 @@
           <w:sz w:val="24"/>
           <w:szCs w:val="24"/>
         </w:rPr>
-        <w:t xml:space="preserve">), lo que él describe como el problema de las </w:t>
+        <w:t xml:space="preserve">), lo que él llama el problema de las </w:t>
       </w:r>
       <w:r>
         <w:rPr>
@@ -546,7 +630,7 @@
           <w:sz w:val="24"/>
           <w:szCs w:val="24"/>
         </w:rPr>
-        <w:t xml:space="preserve">, y por eso no siempre es claro quién responde cuando algo sale mal.</w:t>
+        <w:t xml:space="preserve">, y por ello no siempre es claro quién responde cuando algo sale mal.</w:t>
       </w:r>
     </w:p>
     <w:p>
@@ -561,7 +645,7 @@
           <w:sz w:val="24"/>
           <w:szCs w:val="24"/>
         </w:rPr>
-        <w:t xml:space="preserve">El debate sobre si una IA general llegaría a ser sujeto de derechos y deberes (Aguilar Blanc, 2023) es hoy prospectivo; lo que ya existe es la tentación de atribuir a la herramienta lo que corresponde a quien la diseña, la configura o la usa. Por eso la Recomendación de la Organización de las Naciones Unidas para la Educación, la Ciencia y la Cultura (UNESCO, 2022) establece que debe ser siempre posible atribuir la responsabilidad ética y jurídica de los sistemas de IA a personas físicas o a entidades jurídicas existentes, y la Organisation for Economic Co-operation and Development (OECD, 2024) incluye la rendición de cuentas entre sus principios. Degli-Esposti (2023) coincide: el desarrollo ético de la IA es facultad y responsabilidad de todos los actores involucrados, desde quienes la diseñan hasta quienes la usan, y la rendición de cuentas figura entre los siete requisitos de una IA confiable, con mecanismos para identificar responsabilidades y auditar los sistemas.</w:t>
+        <w:t xml:space="preserve">El debate sobre si una IA general llegaría a ser sujeto de derechos y deberes (Aguilar Blanc, 2023) es hoy prospectivo; lo que ya existe es la tentación de atribuir a la herramienta lo que corresponde a quien la diseña, la configura o la usa. En esa línea, la Recomendación de la Organización de las Naciones Unidas para la Educación, la Ciencia y la Cultura (UNESCO, 2022) establece que debe ser siempre posible atribuir la responsabilidad ética y jurídica de los sistemas de IA a personas físicas o a entidades jurídicas existentes, y la Organisation for Economic Co-operation and Development (OECD, 2024) incluye la rendición de cuentas entre sus principios. Degli-Esposti (2023) coincide: el desarrollo ético de la IA es facultad y responsabilidad de todos los actores involucrados, desde quienes la diseñan hasta quienes la usan, y la rendición de cuentas figura entre los siete requisitos de una IA confiable, con mecanismos para identificar responsabilidades y auditar los sistemas.</w:t>
       </w:r>
     </w:p>
     <w:p>
@@ -594,14 +678,14 @@
           <w:sz w:val="24"/>
           <w:szCs w:val="24"/>
         </w:rPr>
-        <w:t xml:space="preserve"> de las que habla Coeckelbergh (2021). Mi respuesta se tradujo en decisiones de diseño concretas: el folio y los datos oficiales se leen de los registros que mantiene Registro Escolar en lugar de calcularse por el sistema; el sistema valida los datos mínimos y rechaza expresamente lo que no puede hacer bien, como las constancias en inglés, para las cuales no existe plantilla; y cada emisión queda en un historial con versión y marca de tiempo. A ello añado un criterio de gestión: quien activa una emisión es una persona identificable y responde por ella.</w:t>
+        <w:t xml:space="preserve"> de las que habla Coeckelbergh (2021). Mi respuesta se tradujo en decisiones de diseño concretas: el folio y los datos oficiales se leen de los registros que mantiene Registro Escolar en lugar de calcularse por el sistema; el sistema valida los datos mínimos y rechaza expresamente lo que no puede hacer bien, como las constancias en inglés, para las cuales no existe plantilla; y cada emisión queda en un historial con versión y marca de tiempo.</w:t>
       </w:r>
     </w:p>
     <w:p>
       <w:pPr>
         <w:pStyle w:val="Heading2"/>
         <w:keepNext/>
-        <w:spacing w:after="0" w:before="120" w:line="360" w:lineRule="auto"/>
+        <w:spacing w:after="0" w:before="0" w:line="360" w:lineRule="auto"/>
         <w:jc w:val="left"/>
       </w:pPr>
       <w:r>
@@ -628,7 +712,7 @@
           <w:sz w:val="24"/>
           <w:szCs w:val="24"/>
         </w:rPr>
-        <w:t xml:space="preserve">Las actividades del CIESS reúnen datos de participantes de numerosos países: nombres, correos, instituciones, fotografías, calificaciones y, en las inscripciones, documentos de identidad. Hoy esa documentación se recibe por correo electrónico en un único buzón (CIESS, s. f.-b), un canal que no ofrece los controles de un formulario con aviso de privacidad y almacenamiento acotado. Además, el aviso que acompaña a la convocatoria de registro de investigadores limita el uso de los datos a mantener el contacto con la persona y establece que no se difundirán, pero en esa página no menciona los derechos ARCO ni las transferencias (CIESS, s. f.-a).</w:t>
+        <w:t xml:space="preserve">Las actividades del CIESS reúnen datos de participantes de numerosos países: nombres, correos, instituciones, fotografías, calificaciones y, en las inscripciones, documentos de identidad. Hoy esa documentación se recibe por correo electrónico en un único buzón (CIESS, s.f.-b), un canal que no ofrece los controles de un formulario con aviso de privacidad y almacenamiento acotado. Además, el aviso que acompaña a la convocatoria de registro de investigadores limita el uso de los datos a mantener el contacto con la persona y establece que no se difundirán, pero en esa página no menciona los derechos ARCO ni las transferencias (CIESS, s.f.-a).</w:t>
       </w:r>
     </w:p>
     <w:p>
@@ -643,7 +727,7 @@
           <w:sz w:val="24"/>
           <w:szCs w:val="24"/>
         </w:rPr>
-        <w:t xml:space="preserve">Los sistemas que desarrollo se apoyan, además, en servicios de terceros (hojas de cálculo y almacenamiento en la nube, correo transaccional, alojamiento) y, durante su desarrollo, en asistentes de IA generativa. El dilema está entre la comodidad de usar la herramienta más capaz y el deber de proteger lo que las personas confiaron a la institución. Hay dos riesgos distintos. El primero es la exposición: Carlini et al. (2021) demostraron que es posible extraer fragmentos textuales de los datos de entrenamiento de un modelo de lenguaje, incluidos nombres, teléfonos y correos electrónicos, por lo que conviene suponer que lo que se entrega a una herramienta externa podría salir de la institución si el proveedor lo usa para entrenar sus modelos. El segundo es el normativo: la Ley Federal de Protección de Datos Personales en Posesión de los Particulares, que en 2025 sustituyó a la de 2010, exige informar al titular mediante un aviso de privacidad y tratar sus datos de forma legítima (Cámara de Diputados del Honorable Congreso de la Unión [CDHCU], 2025). Aunque el CIESS, como organismo internacional, cuenta con su propio régimen, la tomo como referencia mínima, junto con el principio de privacidad y protección de datos de la UNESCO (2022). Degli-Esposti (2023) recuerda, además, que el buen gobierno de los datos implica preservar la relación de confianza entre quienes ceden los datos y quienes los procesan.</w:t>
+        <w:t xml:space="preserve">Los sistemas que desarrollo dependen también de servicios de terceros (hojas de cálculo y almacenamiento en la nube, correo transaccional, alojamiento) y, durante su desarrollo, en asistentes de IA generativa. El dilema está entre la comodidad de usar la herramienta más capaz y el deber de proteger lo que las personas confiaron a la institución. El primer riesgo es la exposición: Carlini et al. (2021) demostraron que es posible extraer fragmentos textuales de los datos de entrenamiento de un modelo de lenguaje, incluidos nombres, teléfonos y correos electrónicos, por lo que conviene suponer que lo que se entrega a una herramienta externa podría salir de la institución si el proveedor lo usa para entrenar sus modelos. El segundo es el normativo: la Ley Federal de Protección de Datos Personales en Posesión de los Particulares, que en 2025 sustituyó a la de 2010, exige informar al titular mediante un aviso de privacidad y tratar sus datos de forma legítima (Cámara de Diputados del Honorable Congreso de la Unión [CDHCU], 2025). Aunque el CIESS, como organismo internacional, podría regirse por un régimen propio, la tomo como referencia mínima, junto con el principio de privacidad y protección de datos de la UNESCO (2022). Degli-Esposti (2023) recuerda, asimismo, que el buen gobierno de los datos implica preservar la relación de confianza entre quienes ceden los datos y quienes los procesan.</w:t>
       </w:r>
     </w:p>
     <w:p>
@@ -658,14 +742,14 @@
           <w:sz w:val="24"/>
           <w:szCs w:val="24"/>
         </w:rPr>
-        <w:t xml:space="preserve">Mis criterios para este dilema son cuatro. Primero, minimizar: no entregar datos personales reales ni credenciales a herramientas externas, y usar registros de demostración para desarrollar y probar, como lo permite el sistema de registro del congreso. Segundo, evitar copias intermedias: el complemento del campus obtiene las calificaciones directamente de Moodle con los permisos de cada docente, de modo que dejan de circular archivos CSV con datos de estudiantes. Tercero, incorporar el consentimiento y el aviso de privacidad desde el diseño y limitar quién ve qué: el registro del congreso contempla la ley mexicana y las normativas de Brasil y de la Unión Europea, y su panel de análisis —con mapas, tableros y una proyección de inscripciones por regresión lineal simple— restringe el acceso por roles y deja un registro de auditoría. Cuarto, revisar el aviso de privacidad institucional para que mencione expresamente el tratamiento mediante plataformas de terceros y los derechos de las personas.</w:t>
+        <w:t xml:space="preserve">Mis criterios para este dilema son cuatro. Primero, minimizar: no entregar datos personales reales ni credenciales a herramientas externas, y usar registros de demostración para desarrollar y probar, como lo permite el sistema de registro del congreso. Segundo, evitar copias intermedias: el complemento del campus obtiene las calificaciones directamente de Moodle con los permisos de cada docente, de modo que dejan de circular archivos CSV con datos de estudiantes. Tercero, incorporar el consentimiento y el aviso de privacidad desde el diseño y limitar quién ve qué: el registro del congreso contempla la ley mexicana y las normativas de Brasil y de la Unión Europea, y su panel de análisis de datos restringe el acceso por roles y deja un registro de auditoría. Cuarto, revisar el aviso de privacidad institucional para que mencione expresamente el tratamiento mediante plataformas de terceros y los derechos de las personas.</w:t>
       </w:r>
     </w:p>
     <w:p>
       <w:pPr>
         <w:pStyle w:val="Heading2"/>
         <w:keepNext/>
-        <w:spacing w:after="0" w:before="120" w:line="360" w:lineRule="auto"/>
+        <w:spacing w:after="0" w:before="0" w:line="360" w:lineRule="auto"/>
         <w:jc w:val="left"/>
       </w:pPr>
       <w:r>
@@ -692,7 +776,7 @@
           <w:sz w:val="24"/>
           <w:szCs w:val="24"/>
         </w:rPr>
-        <w:t xml:space="preserve">Una constancia o un acta tienen valor porque se confía en su autenticidad. Por eso cada constancia lleva un código QR que apunta al archivo publicado, el sistema comprueba que la dirección responda antes de darla por emitida y la versión anterior se archiva cuando se corrige un dato. Esa trazabilidad se acerca a lo que Floridi et al. (2018) llaman explicabilidad: no solo entender cómo funciona un sistema, sino saber quién responde por él. Coeckelbergh (2021) precisa que explicar no implica necesariamente revelar el código, sino poder explicar las decisiones ante quien resulta afectado por ellas. Eso busca el historial de emisiones: poder decir por qué se emitió un documento, quién lo activó, con qué datos y cuándo. La UNESCO (2022) y la OECD (2024) también exigen transparencia y explicabilidad, y el CIESS reconoce la integridad y la transparencia entre sus valores (CIESS, s. f.-d).</w:t>
+        <w:t xml:space="preserve">Una constancia o un acta tienen valor porque se confía en su autenticidad. De ahí que cada constancia lleve un código QR que apunta al archivo publicado, que el sistema compruebe que la dirección responda antes de darla por emitida y que la versión anterior se archive cuando se corrija un dato. Esa trazabilidad se acerca a lo que Floridi et al. (2018) llaman explicabilidad: no solo entender cómo funciona un sistema, sino saber quién responde por él. Coeckelbergh (2021) precisa que explicar no implica necesariamente revelar el código, sino poder explicar las decisiones ante quien resulta afectado. Eso busca el historial de emisiones: decir por qué se emitió un documento, quién lo activó, con qué datos y cuándo. La UNESCO (2022) y la OECD (2024) también exigen transparencia y explicabilidad, y el CIESS reconoce la integridad y la transparencia entre sus valores (CIESS, s.f.-d).</w:t>
       </w:r>
     </w:p>
     <w:p>
@@ -707,14 +791,14 @@
           <w:sz w:val="24"/>
           <w:szCs w:val="24"/>
         </w:rPr>
-        <w:t xml:space="preserve">La transparencia tiene también una dimensión personal: declarar cuándo se usó IA. Degli-Esposti (2023) recoge como requisito de una IA confiable que “los usuarios y operadores deben ser conscientes de que están interactuando con un sistema de IA y deben conocer las capacidades y limitaciones del mismo” (p. 42), lo que aplica tanto a un asistente virtual de atención como a mis propios sistemas. Los sistemas descritos se construyeron con asistentes de IA generativa, y considero que debe quedar documentado qué generó la herramienta, qué revisó y probó una persona y con qué criterios, de la misma manera en que se citan las fuentes en un trabajo académico. Ocultar el uso de IA no es un problema técnico, sino de honestidad, y erosiona la confianza en documentos que valen precisamente por esa confianza.</w:t>
+        <w:t xml:space="preserve">La transparencia tiene también una dimensión personal: declarar cuándo se usó IA. Degli-Esposti (2023) recoge como requisito de una IA confiable que “los usuarios y operadores deben ser conscientes de que están interactuando con un sistema de IA y deben conocer las capacidades y limitaciones del mismo” (p. 42), lo que aplica tanto a un asistente virtual de atención como a mis propios sistemas. Los sistemas descritos se construyeron con asistentes de IA generativa, y considero que debe quedar documentado qué generó la herramienta, qué revisó y probó una persona y con qué criterios, como se citan las fuentes en un trabajo académico. Ocultar el uso de IA no es un problema técnico, sino de honestidad, y erosiona la confianza en documentos que valen precisamente por esa confianza.</w:t>
       </w:r>
     </w:p>
     <w:p>
       <w:pPr>
         <w:pStyle w:val="Heading2"/>
         <w:keepNext/>
-        <w:spacing w:after="0" w:before="120" w:line="360" w:lineRule="auto"/>
+        <w:spacing w:after="0" w:before="0" w:line="360" w:lineRule="auto"/>
         <w:jc w:val="left"/>
       </w:pPr>
       <w:r>
@@ -741,7 +825,7 @@
           <w:sz w:val="24"/>
           <w:szCs w:val="24"/>
         </w:rPr>
-        <w:t xml:space="preserve">Pasar de siete pasos manuales a uno libera tiempo del personal, pero también cambia su papel. Según la Organización Internacional del Trabajo, las ocupaciones administrativas son las más expuestas a la IA generativa; sin embargo, el efecto dominante sería aumentar las tareas más que eliminar empleos, y el principal riesgo está en la calidad del trabajo, en particular en su intensidad y su autonomía (Gmyrek et al., 2023). Si el tiempo ganado solo se traduce en más carga, la automatización empeora el trabajo en lugar de mejorarlo. No dispongo de un cronometraje formal del procedimiento manual anterior, por lo que hablo de pasos y no de horas ahorradas.</w:t>
+        <w:t xml:space="preserve">Pasar de siete pasos manuales a uno libera tiempo del personal, pero también cambia su papel. Según la Organización Internacional del Trabajo, las ocupaciones administrativas son las más expuestas a la IA generativa; sin embargo, el efecto dominante sería aumentar las tareas más que eliminar empleos, y el principal riesgo está en la calidad del trabajo, en particular en su intensidad y su autonomía (Gmyrek et al., 2023). Si el tiempo ganado solo se traduce en más carga, la automatización empeora el trabajo en lugar de mejorarlo. Sin un cronometraje formal del procedimiento anterior, hablo de pasos y no de horas ahorradas.</w:t>
       </w:r>
     </w:p>
     <w:p>
@@ -756,14 +840,14 @@
           <w:sz w:val="24"/>
           <w:szCs w:val="24"/>
         </w:rPr>
-        <w:t xml:space="preserve">El dilema, entonces, no es si automatizar, sino qué hacer con el tiempo ganado: reasignarlo a tareas de mayor valor, como la atención personalizada a los participantes, la revisión de calidad y el diseño de nuevas actividades, y capacitar al personal para supervisar las herramientas y no solo para usarlas. El CIESS ya cuenta con esa capacidad formativa (CIESS, s. f.-c) y puede aplicarla hacia dentro.</w:t>
+        <w:t xml:space="preserve">El dilema, entonces, no es si automatizar, sino qué hacer con el tiempo ganado: reasignarlo a tareas de mayor valor, como la atención personalizada a los participantes, la revisión de calidad y el diseño de nuevas actividades, y capacitar al personal para supervisar las herramientas y no solo para usarlas. El CIESS ya cuenta con esa capacidad formativa (CIESS, s.f.-c) y puede aplicarla hacia dentro.</w:t>
       </w:r>
     </w:p>
     <w:p>
       <w:pPr>
         <w:pStyle w:val="Heading2"/>
         <w:keepNext/>
-        <w:spacing w:after="0" w:before="120" w:line="360" w:lineRule="auto"/>
+        <w:spacing w:after="0" w:before="0" w:line="360" w:lineRule="auto"/>
         <w:jc w:val="left"/>
       </w:pPr>
       <w:r>
@@ -790,7 +874,7 @@
           <w:sz w:val="24"/>
           <w:szCs w:val="24"/>
         </w:rPr>
-        <w:t xml:space="preserve">A partir de lo anterior, propongo cinco compromisos para el uso de la IA y la automatización en los procesos académicos del CIESS:</w:t>
+        <w:t xml:space="preserve">Propongo cinco compromisos para el uso de la IA y la automatización en los procesos académicos del CIESS:</w:t>
       </w:r>
     </w:p>
     <w:p>
@@ -942,7 +1026,7 @@
       <w:pPr>
         <w:pStyle w:val="Heading2"/>
         <w:keepNext/>
-        <w:spacing w:after="0" w:before="120" w:line="360" w:lineRule="auto"/>
+        <w:spacing w:after="0" w:before="0" w:line="360" w:lineRule="auto"/>
         <w:jc w:val="left"/>
       </w:pPr>
       <w:r>
@@ -969,7 +1053,7 @@
           <w:sz w:val="24"/>
           <w:szCs w:val="24"/>
         </w:rPr>
-        <w:t xml:space="preserve">La IA y la ciencia de datos ofrecen al CIESS una oportunidad real de atender a más personas con mayor calidad, pero no modifican una verdad básica: la herramienta no es un agente moral, y quien la diseña, la configura y la usa conserva la responsabilidad de sus resultados (Coeckelbergh, 2021; Serafim et al., 2024). Quienes diseñamos, desarrollamos y usamos estos sistemas estamos, como señala Degli-Esposti (2023), en la primera línea de la ética de la IA. Mi experiencia desarrollando estos sistemas me enseñó que los riesgos más serios surgen al confiar en la tecnología sin verificarla, al compartir datos sin medir las consecuencias y al no dejar rastro de lo que se hizo. Por eso la ética no frena la innovación: es lo que permite que documentos como las constancias y las actas sigan valiendo. Una institución que enseña a otras a usar la IA de forma responsable tiene la oportunidad, y la obligación, de ser la primera en practicarlo.</w:t>
+        <w:t xml:space="preserve">La IA y la ciencia de datos ofrecen al CIESS una oportunidad real de atender a más personas con mayor calidad, pero no modifican una verdad básica: la herramienta no es un agente moral, y quien la diseña, la configura y la usa conserva la responsabilidad de sus resultados (Coeckelbergh, 2021; Serafim et al., 2024). Quienes diseñamos, desarrollamos y usamos estos sistemas estamos, como señala Degli-Esposti (2023), en la primera línea de la ética de la IA. Mi experiencia desarrollando estos sistemas me enseñó que los riesgos más serios surgen al confiar en la tecnología sin verificarla, al compartir datos sin medir las consecuencias y al no dejar rastro de lo que se hizo. Por eso la ética no frena la innovación: es lo que permite que documentos como las constancias y las actas sigan valiendo. Una institución que enseña a otras a usar la IA con responsabilidad debe ser la primera en practicarlo.</w:t>
       </w:r>
     </w:p>
     <w:p>
@@ -1490,7 +1574,7 @@
         </w:rPr>
         <w:t xml:space="preserve">. Diario Oficial de la Federación. </w:t>
       </w:r>
-      <w:hyperlink w:history="1" r:id="rId1dothru495p_cu5oz-vxc">
+      <w:hyperlink w:history="1" r:id="rIdfilo7abusvj_d19yttfvv">
         <w:r>
           <w:rPr>
             <w:rStyle w:val="Hyperlink"/>
@@ -1534,7 +1618,7 @@
         </w:rPr>
         <w:t xml:space="preserve"> (pp. 2633-2650). USENIX Association. </w:t>
       </w:r>
-      <w:hyperlink w:history="1" r:id="rIdvrz-gso8lsiu1azfg8a6q">
+      <w:hyperlink w:history="1" r:id="rIdrwahcou7zwdbebxqi-39m">
         <w:r>
           <w:rPr>
             <w:rStyle w:val="Hyperlink"/>
@@ -1558,7 +1642,7 @@
           <w:sz w:val="24"/>
           <w:szCs w:val="24"/>
         </w:rPr>
-        <w:t xml:space="preserve">Centro Interamericano de Estudios de Seguridad Social. (s. f.-a). </w:t>
+        <w:t xml:space="preserve">Centro Interamericano de Estudios de Seguridad Social. (s.f.-a). </w:t>
       </w:r>
       <w:r>
         <w:rPr>
@@ -1578,7 +1662,7 @@
         </w:rPr>
         <w:t xml:space="preserve">. </w:t>
       </w:r>
-      <w:hyperlink w:history="1" r:id="rIdfin80t8drhn2rrhw7fpf6">
+      <w:hyperlink w:history="1" r:id="rIdhmndftgzdwzhg1mpdbxbo">
         <w:r>
           <w:rPr>
             <w:rStyle w:val="Hyperlink"/>
@@ -1602,7 +1686,7 @@
           <w:sz w:val="24"/>
           <w:szCs w:val="24"/>
         </w:rPr>
-        <w:t xml:space="preserve">Centro Interamericano de Estudios de Seguridad Social. (s. f.-b). </w:t>
+        <w:t xml:space="preserve">Centro Interamericano de Estudios de Seguridad Social. (s.f.-b). </w:t>
       </w:r>
       <w:r>
         <w:rPr>
@@ -1622,7 +1706,7 @@
         </w:rPr>
         <w:t xml:space="preserve">. </w:t>
       </w:r>
-      <w:hyperlink w:history="1" r:id="rIdmuyv9hzjpanfuzvjgfpkb">
+      <w:hyperlink w:history="1" r:id="rIdey2nkvmj6ubh3uourqf0f">
         <w:r>
           <w:rPr>
             <w:rStyle w:val="Hyperlink"/>
@@ -1646,7 +1730,7 @@
           <w:sz w:val="24"/>
           <w:szCs w:val="24"/>
         </w:rPr>
-        <w:t xml:space="preserve">Centro Interamericano de Estudios de Seguridad Social. (s. f.-c). </w:t>
+        <w:t xml:space="preserve">Centro Interamericano de Estudios de Seguridad Social. (s.f.-c). </w:t>
       </w:r>
       <w:r>
         <w:rPr>
@@ -1666,7 +1750,7 @@
         </w:rPr>
         <w:t xml:space="preserve">. </w:t>
       </w:r>
-      <w:hyperlink w:history="1" r:id="rIdrixr9kubm_st3ls-1nu3f">
+      <w:hyperlink w:history="1" r:id="rIda-c0ikvgycbwdsf5um7_g">
         <w:r>
           <w:rPr>
             <w:rStyle w:val="Hyperlink"/>
@@ -1690,7 +1774,7 @@
           <w:sz w:val="24"/>
           <w:szCs w:val="24"/>
         </w:rPr>
-        <w:t xml:space="preserve">Centro Interamericano de Estudios de Seguridad Social. (s. f.-d). </w:t>
+        <w:t xml:space="preserve">Centro Interamericano de Estudios de Seguridad Social. (s.f.-d). </w:t>
       </w:r>
       <w:r>
         <w:rPr>
@@ -1710,7 +1794,7 @@
         </w:rPr>
         <w:t xml:space="preserve">. </w:t>
       </w:r>
-      <w:hyperlink w:history="1" r:id="rIdwnrltksvngon7yyuhhgnp">
+      <w:hyperlink w:history="1" r:id="rIdot2a2q5pkvlc_ydy1avuu">
         <w:r>
           <w:rPr>
             <w:rStyle w:val="Hyperlink"/>
@@ -1820,7 +1904,7 @@
         </w:rPr>
         <w:t xml:space="preserve">, 40-60. </w:t>
       </w:r>
-      <w:hyperlink w:history="1" r:id="rIdjcncqjvfdecsx4ahvfmr5">
+      <w:hyperlink w:history="1" r:id="rIdmbfr3vh6wkfxdsuw6nahp">
         <w:r>
           <w:rPr>
             <w:rStyle w:val="Hyperlink"/>
@@ -1864,7 +1948,7 @@
         </w:rPr>
         <w:t xml:space="preserve">(4), 689-707. </w:t>
       </w:r>
-      <w:hyperlink w:history="1" r:id="rId8oneikvnqmlbdsxtlxdqh">
+      <w:hyperlink w:history="1" r:id="rId6yvhpbfhcgzsffhfw1gik">
         <w:r>
           <w:rPr>
             <w:rStyle w:val="Hyperlink"/>
@@ -1908,7 +1992,7 @@
         </w:rPr>
         <w:t xml:space="preserve"> (ILO Working Paper 96). International Labour Organization. </w:t>
       </w:r>
-      <w:hyperlink w:history="1" r:id="rIdewoaosdiwrssjx2sp9mhp">
+      <w:hyperlink w:history="1" r:id="rId6khakckjh7om6s8-hzlu5">
         <w:r>
           <w:rPr>
             <w:rStyle w:val="Hyperlink"/>
@@ -1985,7 +2069,7 @@
         </w:rPr>
         <w:t xml:space="preserve"> (OECD/LEGAL/0449). OECD Legal Instruments. </w:t>
       </w:r>
-      <w:hyperlink w:history="1" r:id="rIdf-18mgahgmo7prnz2covb">
+      <w:hyperlink w:history="1" r:id="rId-g_cmo31ywvtgahpij3sl">
         <w:r>
           <w:rPr>
             <w:rStyle w:val="Hyperlink"/>
@@ -2029,7 +2113,7 @@
         </w:rPr>
         <w:t xml:space="preserve"> (SHS/BIO/PI/2021/1). </w:t>
       </w:r>
-      <w:hyperlink w:history="1" r:id="rIddkhoti7bzxjhaqpcb1kfr">
+      <w:hyperlink w:history="1" r:id="rId7ebd7mvfky66vouyhgc-c">
         <w:r>
           <w:rPr>
             <w:rStyle w:val="Hyperlink"/>
@@ -2073,7 +2157,7 @@
         </w:rPr>
         <w:t xml:space="preserve">(3), 381-410. </w:t>
       </w:r>
-      <w:hyperlink w:history="1" r:id="rIdfyhtda5t9hhnorkmq3ml3">
+      <w:hyperlink w:history="1" r:id="rIddu8fqjz0tvgz2by-uuc89">
         <w:r>
           <w:rPr>
             <w:rStyle w:val="Hyperlink"/>

</xml_diff>

<commit_message>
Ensayo R2: contexto real con el CV, actores y riesgos, quinto dilema y una cita de las lecturas en cada dilema
Co-Authored-By: Claude Sonnet 5.5 <noreply@anthropic.com>
Claude-Session: https://claude.ai/code/session_012HQtHGEWw83YL2w3UxYHZx
</commit_message>
<xml_diff>
--- a/maestria/Navarrete_Arturo_R2_U2.docx
+++ b/maestria/Navarrete_Arturo_R2_U2.docx
@@ -378,7 +378,7 @@
           <w:sz w:val="24"/>
           <w:szCs w:val="24"/>
         </w:rPr>
-        <w:t xml:space="preserve">El Centro Interamericano de Estudios de Seguridad Social (CIESS, s.f.-d) es el órgano de docencia, capacitación e investigación de la Conferencia Interamericana de Seguridad Social (CISS), un organismo internacional, técnico y sin fines de lucro que integra a más de 80 instituciones de 36 países. Laboro en esta institución, donde desarrollo y mantengo herramientas digitales que apoyan su operación académica: un sistema que automatiza la emisión de constancias, un sistema de registro con panel de análisis de datos para un congreso internacional y un complemento (</w:t>
+        <w:t xml:space="preserve">El Centro Interamericano de Estudios de Seguridad Social (CIESS, s.f.-d) es el órgano de docencia, capacitación e investigación de la Conferencia Interamericana de Seguridad Social (CISS), un organismo internacional, técnico y sin fines de lucro que integra a más de 80 instituciones de 36 países. Laboro en esta institución desde 2014, como diseñador UX/UI y desarrollador de herramientas digitales: sitios web accesibles, bases de datos educativas, reportes y tableros de datos y, más recientemente, un sistema de emisión de constancias, un sistema de registro con panel de análisis de datos para un congreso internacional y un complemento (</w:t>
       </w:r>
       <w:r>
         <w:rPr>
@@ -396,22 +396,22 @@
           <w:sz w:val="24"/>
           <w:szCs w:val="24"/>
         </w:rPr>
-        <w:t xml:space="preserve">) del campus virtual que genera actas de calificaciones. Estas herramientas manejan datos de personas de numerosos países y se construyeron con apoyo de asistentes de inteligencia artificial (IA) generativa.</w:t>
-      </w:r>
-    </w:p>
-    <w:p>
-      <w:pPr>
-        <w:spacing w:after="0" w:before="0" w:line="360" w:lineRule="auto"/>
-        <w:ind w:firstLine="720"/>
-        <w:jc w:val="both"/>
-      </w:pPr>
-      <w:r>
-        <w:rPr>
-          <w:rFonts w:ascii="Arial" w:cs="Arial" w:eastAsia="Arial" w:hAnsi="Arial"/>
-          <w:sz w:val="24"/>
-          <w:szCs w:val="24"/>
-        </w:rPr>
-        <w:t xml:space="preserve">En este contexto identifico cuatro dilemas éticos principales en la aplicación de la ciencia de datos y la IA. El primero es el de la responsabilidad: cuando una tarea se automatiza, ¿quién responde por un error que se replica a escala? El segundo es el de la confidencialidad: ¿qué datos personales o institucionales pueden confiarse a plataformas y asistentes externos? El tercero es el de la transparencia: ¿cómo se deja constancia de qué hizo la máquina y qué hizo una persona? El cuarto es el del efecto sobre el trabajo del personal administrativo, que es el más expuesto a estas tecnologías.</w:t>
+        <w:t xml:space="preserve">) del campus virtual para generar actas de calificaciones. Estas herramientas manejan datos de personas de numerosos países y se construyeron con apoyo de asistentes de inteligencia artificial (IA) generativa.</w:t>
+      </w:r>
+    </w:p>
+    <w:p>
+      <w:pPr>
+        <w:spacing w:after="0" w:before="0" w:line="360" w:lineRule="auto"/>
+        <w:ind w:firstLine="720"/>
+        <w:jc w:val="both"/>
+      </w:pPr>
+      <w:r>
+        <w:rPr>
+          <w:rFonts w:ascii="Arial" w:cs="Arial" w:eastAsia="Arial" w:hAnsi="Arial"/>
+          <w:sz w:val="24"/>
+          <w:szCs w:val="24"/>
+        </w:rPr>
+        <w:t xml:space="preserve">En este contexto identifico cinco dilemas éticos principales en la aplicación de la ciencia de datos y la IA. El primero es el de la responsabilidad: cuando una tarea se automatiza, ¿quién responde por un error que se replica a escala? El segundo es el de la confidencialidad: ¿qué datos personales o institucionales pueden confiarse a plataformas y asistentes externos? El tercero es el de la transparencia: ¿cómo se deja constancia de qué hizo la máquina y qué hizo una persona? El cuarto es el del efecto sobre el trabajo del personal administrativo, que es el más expuesto a estas tecnologías. El quinto, de carácter prospectivo, es el de la equidad: ¿cómo evitar que los sesgos de los datos y de los sistemas desfavorezcan a ciertos países, idiomas o personas?</w:t>
       </w:r>
     </w:p>
     <w:p>
@@ -464,22 +464,37 @@
           <w:sz w:val="24"/>
           <w:szCs w:val="24"/>
         </w:rPr>
-        <w:t xml:space="preserve">La ciencia de datos y la IA en la operación del CIESS</w:t>
-      </w:r>
-    </w:p>
-    <w:p>
-      <w:pPr>
-        <w:spacing w:after="0" w:before="0" w:line="360" w:lineRule="auto"/>
-        <w:ind w:firstLine="720"/>
-        <w:jc w:val="both"/>
-      </w:pPr>
-      <w:r>
-        <w:rPr>
-          <w:rFonts w:ascii="Arial" w:cs="Arial" w:eastAsia="Arial" w:hAnsi="Arial"/>
-          <w:sz w:val="24"/>
-          <w:szCs w:val="24"/>
-        </w:rPr>
-        <w:t xml:space="preserve">El CIESS ofrece cursos, diplomados, seminarios, talleres y microaprendizajes con apoyo de su campus virtual. Cada actividad genera datos de inscripción, acreditación y calificaciones, así como documentos con valor curricular para quien los recibe. Mi trabajo consiste en reducir la carga manual de esos procesos. El sistema de constancias sustituyó un procedimiento de siete pasos manuales —entre ellos la composición en software de diseño, la generación del código QR y la publicación por FTP— por un flujo que se dispara desde una casilla de la base de datos académica: el sistema compone el documento, genera el QR, lo publica, verifica que la dirección responda y registra la emisión en un historial. El sistema de registro del congreso incluye un formulario trilingüe, un panel de análisis de datos (tableros, mapas y una proyección de inscripciones mediante regresión lineal simple), el dictamen de ponencias y el consentimiento informado de cada participante. El complemento del campus virtual permite que el personal docente genere las actas de calificaciones sin salir de la plataforma ni descargar y volver a cargar archivos CSV.</w:t>
+        <w:t xml:space="preserve">Contexto real: la ciencia de datos y la IA en mi trabajo</w:t>
+      </w:r>
+    </w:p>
+    <w:p>
+      <w:pPr>
+        <w:spacing w:after="0" w:before="0" w:line="360" w:lineRule="auto"/>
+        <w:ind w:firstLine="720"/>
+        <w:jc w:val="both"/>
+      </w:pPr>
+      <w:r>
+        <w:rPr>
+          <w:rFonts w:ascii="Arial" w:cs="Arial" w:eastAsia="Arial" w:hAnsi="Arial"/>
+          <w:sz w:val="24"/>
+          <w:szCs w:val="24"/>
+        </w:rPr>
+        <w:t xml:space="preserve">El CIESS ofrece cursos, diplomados, seminarios, talleres y microaprendizajes con apoyo de su campus virtual. Cada actividad genera datos de inscripción, acreditación y calificaciones, así como documentos con valor curricular para quien los recibe. Mi trabajo consiste en diseñar, desarrollar y mantener las herramientas digitales que sostienen esa operación: el sitio web institucional y sus micrositios, con estrategias de accesibilidad y análisis de usabilidad; la producción editorial y multimedia (informes anuales, boletines, revistas electrónicas, infografías y tableros de datos); las bases de datos educativas para el seguimiento de inscripciones, becas, docentes y sesiones por Zoom; y la generación automática de reportes académicos y financieros en hojas de cálculo con visualización de datos.</w:t>
+      </w:r>
+    </w:p>
+    <w:p>
+      <w:pPr>
+        <w:spacing w:after="0" w:before="0" w:line="360" w:lineRule="auto"/>
+        <w:ind w:firstLine="720"/>
+        <w:jc w:val="both"/>
+      </w:pPr>
+      <w:r>
+        <w:rPr>
+          <w:rFonts w:ascii="Arial" w:cs="Arial" w:eastAsia="Arial" w:hAnsi="Arial"/>
+          <w:sz w:val="24"/>
+          <w:szCs w:val="24"/>
+        </w:rPr>
+        <w:t xml:space="preserve">A ello se suman tres desarrollos recientes. El sistema de constancias sustituyó un procedimiento de siete pasos manuales —entre ellos la composición en software de diseño, la generación del código QR y la publicación por FTP— por un flujo que se dispara desde una casilla de la base de datos académica: el sistema compone el documento, genera el QR, lo publica, verifica que la dirección responda y registra la emisión en un historial. El sistema de registro del congreso incluye un formulario trilingüe, un panel de análisis de datos (tableros, mapas y una proyección de inscripciones mediante regresión lineal simple), el dictamen de ponencias y el consentimiento informado de cada participante. El complemento del campus virtual permite que el personal docente genere las actas de calificaciones sin salir de la plataforma ni descargar y volver a cargar archivos CSV.</w:t>
       </w:r>
     </w:p>
     <w:p>
@@ -495,6 +510,21 @@
           <w:szCs w:val="24"/>
         </w:rPr>
         <w:t xml:space="preserve">Conviene precisar que el motor de constancias es automatización basada en reglas y no aprendizaje automático. Aun así, enfrenta los mismos dilemas que un sistema de IA, porque delega en una máquina una tarea con consecuencias para personas reales, y se desarrolló con asistentes de IA generativa. Por otra parte, el CIESS imparte un microaprendizaje dirigido al personal administrativo y técnico de instituciones de seguridad social para usar de forma efectiva y responsable asistentes de IA generativa, con un módulo sobre uso responsable, ética y privacidad (CIESS, s.f.-c). Esto plantea una exigencia de coherencia: una institución que forma a otros en el uso responsable de la IA debe practicarlo en su propia operación, en línea con sus valores de integridad y transparencia (CIESS, s.f.-d).</w:t>
+      </w:r>
+    </w:p>
+    <w:p>
+      <w:pPr>
+        <w:spacing w:after="0" w:before="0" w:line="360" w:lineRule="auto"/>
+        <w:ind w:firstLine="720"/>
+        <w:jc w:val="both"/>
+      </w:pPr>
+      <w:r>
+        <w:rPr>
+          <w:rFonts w:ascii="Arial" w:cs="Arial" w:eastAsia="Arial" w:hAnsi="Arial"/>
+          <w:sz w:val="24"/>
+          <w:szCs w:val="24"/>
+        </w:rPr>
+        <w:t xml:space="preserve">En estos procesos intervienen participantes y docentes de numerosos países, el personal administrativo y de Registro Escolar, el área de diseño y desarrollo en la que laboro, la dirección del CIESS y de la CISS, las instituciones y universidades miembro, y los proveedores tecnológicos de terceros. Cada dilema afecta de manera distinta a estos actores, como se verá a continuación.</w:t>
       </w:r>
     </w:p>
     <w:p>
@@ -528,22 +558,47 @@
           <w:sz w:val="24"/>
           <w:szCs w:val="24"/>
         </w:rPr>
-        <w:t xml:space="preserve">Automatizar multiplica la capacidad, pero también multiplica el error. Un descuido al elaborar una constancia a mano afecta a una persona; el mismo descuido en un sistema que emite decenas de documentos con un clic afecta a todas. Lo viví a pequeña escala: al probar el sistema en una copia de la base de datos antes de conectarlo a la real, detecté que las fechas llegaban en un formato distinto al esperado y que el cálculo del periodo habría publicado las constancias en una ruta inexistente. Lo detecté al revisar el resultado, no porque la máquina lo señalara.</w:t>
-      </w:r>
-    </w:p>
-    <w:p>
-      <w:pPr>
-        <w:spacing w:after="0" w:before="0" w:line="360" w:lineRule="auto"/>
-        <w:ind w:firstLine="720"/>
-        <w:jc w:val="both"/>
-      </w:pPr>
-      <w:r>
-        <w:rPr>
-          <w:rFonts w:ascii="Arial" w:cs="Arial" w:eastAsia="Arial" w:hAnsi="Arial"/>
-          <w:sz w:val="24"/>
-          <w:szCs w:val="24"/>
-        </w:rPr>
-        <w:t xml:space="preserve">La literatura explica por qué esa revisión no debe darse por sentada. Parasuraman y Manzey (2010) describen que quienes supervisan sistemas automatizados tienden a la complacencia y al sesgo de automatización: confían en el sistema y verifican menos su resultado, lo que puede producir errores de omisión y de comisión. Cuando el error ocurre, la responsabilidad suele recaer en quien está más cerca de la máquina. Elish (2019) llama zonas de deformación moral (</w:t>
+        <w:t xml:space="preserve">Automatizar multiplica la capacidad, pero también multiplica el error. Un descuido al elaborar una constancia a mano afecta a una persona; el mismo descuido en un sistema que emite decenas de documentos con un clic afecta a todas. Lo mismo ocurre con los reportes académicos y financieros que se generan de forma automática y con los tableros que se publican: una fórmula errónea se replica en cada informe. Lo viví a pequeña escala: al probar el sistema de constancias en una copia de la base de datos antes de conectarlo a la real, detecté que las fechas llegaban en un formato distinto al esperado y que el cálculo del periodo habría publicado las constancias en una ruta inexistente. Lo detecté al revisar el resultado, no porque la máquina lo señalara.</w:t>
+      </w:r>
+    </w:p>
+    <w:p>
+      <w:pPr>
+        <w:spacing w:after="0" w:before="0" w:line="360" w:lineRule="auto"/>
+        <w:ind w:firstLine="720"/>
+        <w:jc w:val="both"/>
+      </w:pPr>
+      <w:r>
+        <w:rPr>
+          <w:rFonts w:ascii="Arial" w:cs="Arial" w:eastAsia="Arial" w:hAnsi="Arial"/>
+          <w:b/>
+          <w:bCs/>
+          <w:sz w:val="24"/>
+          <w:szCs w:val="24"/>
+        </w:rPr>
+        <w:t xml:space="preserve">Actores, beneficios y riesgos.</w:t>
+      </w:r>
+      <w:r>
+        <w:rPr>
+          <w:rFonts w:ascii="Arial" w:cs="Arial" w:eastAsia="Arial" w:hAnsi="Arial"/>
+          <w:sz w:val="24"/>
+          <w:szCs w:val="24"/>
+        </w:rPr>
+        <w:t xml:space="preserve"> Comparten este dilema quienes activan las emisiones, quienes desarrollan y mantienen el sistema, Registro Escolar, la dirección y las personas que reciben el documento. El beneficio es evidente: menos pasos manuales y respuestas más rápidas. El riesgo es que un error se replique a escala sin una persona claramente responsable.</w:t>
+      </w:r>
+    </w:p>
+    <w:p>
+      <w:pPr>
+        <w:spacing w:after="0" w:before="0" w:line="360" w:lineRule="auto"/>
+        <w:ind w:firstLine="720"/>
+        <w:jc w:val="both"/>
+      </w:pPr>
+      <w:r>
+        <w:rPr>
+          <w:rFonts w:ascii="Arial" w:cs="Arial" w:eastAsia="Arial" w:hAnsi="Arial"/>
+          <w:sz w:val="24"/>
+          <w:szCs w:val="24"/>
+        </w:rPr>
+        <w:t xml:space="preserve">La literatura explica por qué la revisión humana del resultado no debe darse por sentada. Parasuraman y Manzey (2010) describen que quienes supervisan sistemas automatizados tienden a la complacencia y al sesgo de automatización: confían en el sistema y verifican menos su resultado, lo que puede producir errores de omisión y de comisión. Cuando el error ocurre, la responsabilidad suele recaer en quien está más cerca de la máquina. Elish (2019) llama zonas de deformación moral (</w:t>
       </w:r>
       <w:r>
         <w:rPr>
@@ -712,37 +767,62 @@
           <w:sz w:val="24"/>
           <w:szCs w:val="24"/>
         </w:rPr>
-        <w:t xml:space="preserve">Las actividades del CIESS reúnen datos de participantes de numerosos países: nombres, correos, instituciones, fotografías, calificaciones y, en las inscripciones, documentos de identidad. Hoy esa documentación se recibe por correo electrónico en un único buzón (CIESS, s.f.-b), un canal que no ofrece los controles de un formulario con aviso de privacidad y almacenamiento acotado. Además, el aviso que acompaña a la convocatoria de registro de investigadores limita el uso de los datos a mantener el contacto con la persona y establece que no se difundirán, pero en esa página no menciona los derechos ARCO ni las transferencias (CIESS, s.f.-a).</w:t>
-      </w:r>
-    </w:p>
-    <w:p>
-      <w:pPr>
-        <w:spacing w:after="0" w:before="0" w:line="360" w:lineRule="auto"/>
-        <w:ind w:firstLine="720"/>
-        <w:jc w:val="both"/>
-      </w:pPr>
-      <w:r>
-        <w:rPr>
-          <w:rFonts w:ascii="Arial" w:cs="Arial" w:eastAsia="Arial" w:hAnsi="Arial"/>
-          <w:sz w:val="24"/>
-          <w:szCs w:val="24"/>
-        </w:rPr>
-        <w:t xml:space="preserve">Los sistemas que desarrollo dependen también de servicios de terceros (hojas de cálculo y almacenamiento en la nube, correo transaccional, alojamiento) y, durante su desarrollo, en asistentes de IA generativa. El dilema está entre la comodidad de usar la herramienta más capaz y el deber de proteger lo que las personas confiaron a la institución. El primer riesgo es la exposición: Carlini et al. (2021) demostraron que es posible extraer fragmentos textuales de los datos de entrenamiento de un modelo de lenguaje, incluidos nombres, teléfonos y correos electrónicos, por lo que conviene suponer que lo que se entrega a una herramienta externa podría salir de la institución si el proveedor lo usa para entrenar sus modelos. El segundo es el normativo: la Ley Federal de Protección de Datos Personales en Posesión de los Particulares, que en 2025 sustituyó a la de 2010, exige informar al titular mediante un aviso de privacidad y tratar sus datos de forma legítima (Cámara de Diputados del Honorable Congreso de la Unión [CDHCU], 2025). Aunque el CIESS, como organismo internacional, podría regirse por un régimen propio, la tomo como referencia mínima, junto con el principio de privacidad y protección de datos de la UNESCO (2022). Degli-Esposti (2023) recuerda, asimismo, que el buen gobierno de los datos implica preservar la relación de confianza entre quienes ceden los datos y quienes los procesan.</w:t>
-      </w:r>
-    </w:p>
-    <w:p>
-      <w:pPr>
-        <w:spacing w:after="0" w:before="0" w:line="360" w:lineRule="auto"/>
-        <w:ind w:firstLine="720"/>
-        <w:jc w:val="both"/>
-      </w:pPr>
-      <w:r>
-        <w:rPr>
-          <w:rFonts w:ascii="Arial" w:cs="Arial" w:eastAsia="Arial" w:hAnsi="Arial"/>
-          <w:sz w:val="24"/>
-          <w:szCs w:val="24"/>
-        </w:rPr>
-        <w:t xml:space="preserve">Mis criterios para este dilema son cuatro. Primero, minimizar: no entregar datos personales reales ni credenciales a herramientas externas, y usar registros de demostración para desarrollar y probar, como lo permite el sistema de registro del congreso. Segundo, evitar copias intermedias: el complemento del campus obtiene las calificaciones directamente de Moodle con los permisos de cada docente, de modo que dejan de circular archivos CSV con datos de estudiantes. Tercero, incorporar el consentimiento y el aviso de privacidad desde el diseño y limitar quién ve qué: el registro del congreso contempla la ley mexicana y las normativas de Brasil y de la Unión Europea, y su panel de análisis de datos restringe el acceso por roles y deja un registro de auditoría. Cuarto, revisar el aviso de privacidad institucional para que mencione expresamente el tratamiento mediante plataformas de terceros y los derechos de las personas.</w:t>
+        <w:t xml:space="preserve">Las actividades del CIESS reúnen datos de participantes de numerosos países: nombres, correos, instituciones, fotografías, calificaciones y, en las inscripciones, documentos de identidad. Las bases de datos educativas que administro concentran además información de becas y docentes, y el directorio de la Red Interamericana de Universidades para la Seguridad Social (RIUSS) contiene nombres, cargos y correos de representantes institucionales. Hoy la documentación de inscripción se recibe por correo electrónico en un único buzón (CIESS, s.f.-b), un canal que no ofrece los controles de un formulario con aviso de privacidad y almacenamiento acotado. Además, el aviso que acompaña a la convocatoria de registro de investigadores limita el uso de los datos a mantener el contacto con la persona y establece que no se difundirán, pero en esa página no menciona los derechos ARCO ni las transferencias (CIESS, s.f.-a).</w:t>
+      </w:r>
+    </w:p>
+    <w:p>
+      <w:pPr>
+        <w:spacing w:after="0" w:before="0" w:line="360" w:lineRule="auto"/>
+        <w:ind w:firstLine="720"/>
+        <w:jc w:val="both"/>
+      </w:pPr>
+      <w:r>
+        <w:rPr>
+          <w:rFonts w:ascii="Arial" w:cs="Arial" w:eastAsia="Arial" w:hAnsi="Arial"/>
+          <w:b/>
+          <w:bCs/>
+          <w:sz w:val="24"/>
+          <w:szCs w:val="24"/>
+        </w:rPr>
+        <w:t xml:space="preserve">Actores, beneficios y riesgos.</w:t>
+      </w:r>
+      <w:r>
+        <w:rPr>
+          <w:rFonts w:ascii="Arial" w:cs="Arial" w:eastAsia="Arial" w:hAnsi="Arial"/>
+          <w:sz w:val="24"/>
+          <w:szCs w:val="24"/>
+        </w:rPr>
+        <w:t xml:space="preserve"> Participantes, docentes y representantes institucionales ceden sus datos; el personal administrativo y mi área los tratan; los proveedores tecnológicos y de IA los alojan o procesan, y las autoridades de protección de datos vigilan su uso. La ventaja es contar con procesos ágiles y con analítica útil para planear; el riesgo, la exposición o el uso indebido de esos datos.</w:t>
+      </w:r>
+    </w:p>
+    <w:p>
+      <w:pPr>
+        <w:spacing w:after="0" w:before="0" w:line="360" w:lineRule="auto"/>
+        <w:ind w:firstLine="720"/>
+        <w:jc w:val="both"/>
+      </w:pPr>
+      <w:r>
+        <w:rPr>
+          <w:rFonts w:ascii="Arial" w:cs="Arial" w:eastAsia="Arial" w:hAnsi="Arial"/>
+          <w:sz w:val="24"/>
+          <w:szCs w:val="24"/>
+        </w:rPr>
+        <w:t xml:space="preserve">Los sistemas que desarrollo dependen también de servicios de terceros (hojas de cálculo y almacenamiento en la nube, correo transaccional, alojamiento) y, durante su desarrollo, de asistentes de IA generativa. El dilema está entre la comodidad de usar la herramienta más capaz y el deber de proteger lo que las personas confiaron a la institución. El primer riesgo es la exposición: Carlini et al. (2021) demostraron que es posible extraer fragmentos textuales de los datos de entrenamiento de un modelo de lenguaje, incluidos nombres, teléfonos y correos electrónicos, por lo que conviene suponer que lo que se entrega a una herramienta externa podría salir de la institución si el proveedor lo usa para entrenar sus modelos. El segundo es el normativo: la Ley Federal de Protección de Datos Personales en Posesión de los Particulares, que en 2025 sustituyó a la de 2010, exige informar al titular mediante un aviso de privacidad y tratar sus datos de forma legítima (Cámara de Diputados del Honorable Congreso de la Unión [CDHCU], 2025). Aunque el CIESS, como organismo internacional, podría regirse por un régimen propio, la tomo como referencia mínima, junto con el principio de privacidad y protección de datos de la UNESCO (2022). Degli-Esposti (2023) recuerda, asimismo, que el buen gobierno de los datos implica preservar la relación de confianza entre quienes ceden los datos y quienes los procesan.</w:t>
+      </w:r>
+    </w:p>
+    <w:p>
+      <w:pPr>
+        <w:spacing w:after="0" w:before="0" w:line="360" w:lineRule="auto"/>
+        <w:ind w:firstLine="720"/>
+        <w:jc w:val="both"/>
+      </w:pPr>
+      <w:r>
+        <w:rPr>
+          <w:rFonts w:ascii="Arial" w:cs="Arial" w:eastAsia="Arial" w:hAnsi="Arial"/>
+          <w:sz w:val="24"/>
+          <w:szCs w:val="24"/>
+        </w:rPr>
+        <w:t xml:space="preserve">Mis criterios para este dilema son cuatro. Primero, minimizar: no entregar datos personales reales ni credenciales a herramientas externas, usar registros de demostración para desarrollar y probar, como lo permite el sistema de registro del congreso, y publicar en tableros y reportes solo información agregada. Segundo, evitar copias intermedias: el complemento del campus obtiene las calificaciones directamente de Moodle con los permisos de cada docente, de modo que dejan de circular archivos CSV con datos de estudiantes. Tercero, incorporar el consentimiento y el aviso de privacidad desde el diseño y limitar quién ve qué: el registro del congreso contempla la ley mexicana y las normativas de Brasil y de la Unión Europea, y su panel de análisis de datos restringe el acceso por roles y deja un registro de auditoría. Cuarto, revisar el aviso de privacidad institucional para que mencione expresamente el tratamiento mediante plataformas de terceros y los derechos de las personas.</w:t>
       </w:r>
     </w:p>
     <w:p>
@@ -788,10 +868,35 @@
       <w:r>
         <w:rPr>
           <w:rFonts w:ascii="Arial" w:cs="Arial" w:eastAsia="Arial" w:hAnsi="Arial"/>
-          <w:sz w:val="24"/>
-          <w:szCs w:val="24"/>
-        </w:rPr>
-        <w:t xml:space="preserve">La transparencia tiene también una dimensión personal: declarar cuándo se usó IA. Degli-Esposti (2023) recoge como requisito de una IA confiable que “los usuarios y operadores deben ser conscientes de que están interactuando con un sistema de IA y deben conocer las capacidades y limitaciones del mismo” (p. 42), lo que aplica tanto a un asistente virtual de atención como a mis propios sistemas. Los sistemas descritos se construyeron con asistentes de IA generativa, y considero que debe quedar documentado qué generó la herramienta, qué revisó y probó una persona y con qué criterios, como se citan las fuentes en un trabajo académico. Ocultar el uso de IA no es un problema técnico, sino de honestidad, y erosiona la confianza en documentos que valen precisamente por esa confianza.</w:t>
+          <w:b/>
+          <w:bCs/>
+          <w:sz w:val="24"/>
+          <w:szCs w:val="24"/>
+        </w:rPr>
+        <w:t xml:space="preserve">Actores, beneficios y riesgos.</w:t>
+      </w:r>
+      <w:r>
+        <w:rPr>
+          <w:rFonts w:ascii="Arial" w:cs="Arial" w:eastAsia="Arial" w:hAnsi="Arial"/>
+          <w:sz w:val="24"/>
+          <w:szCs w:val="24"/>
+        </w:rPr>
+        <w:t xml:space="preserve"> Los participantes y las instituciones que verifican un documento esperan poder confiar en él, y quienes lo producen —el equipo de desarrollo y el editorial— deben poder explicarlo. El beneficio es la confianza y la trazabilidad; el riesgo, ocultar el uso de IA o no poder explicar una decisión.</w:t>
+      </w:r>
+    </w:p>
+    <w:p>
+      <w:pPr>
+        <w:spacing w:after="0" w:before="0" w:line="360" w:lineRule="auto"/>
+        <w:ind w:firstLine="720"/>
+        <w:jc w:val="both"/>
+      </w:pPr>
+      <w:r>
+        <w:rPr>
+          <w:rFonts w:ascii="Arial" w:cs="Arial" w:eastAsia="Arial" w:hAnsi="Arial"/>
+          <w:sz w:val="24"/>
+          <w:szCs w:val="24"/>
+        </w:rPr>
+        <w:t xml:space="preserve">La transparencia tiene también una dimensión personal: declarar cuándo se usó IA. Degli-Esposti (2023) recoge como requisito de una IA confiable que “los usuarios y operadores deben ser conscientes de que están interactuando con un sistema de IA y deben conocer las capacidades y limitaciones del mismo” (p. 42), lo que aplica tanto a un asistente virtual de atención como a mis propios sistemas. Los sistemas descritos se construyeron con asistentes de IA generativa, y considero que debe quedar documentado qué generó la herramienta, qué revisó y probó una persona y con qué criterios, como se citan las fuentes en un trabajo académico. Lo mismo vale para la producción editorial y multimedia —informes anuales, boletines, revistas electrónicas, infografías—: si se usa IA para redactar, ilustrar o narrar, el lector merece saberlo. Ocultar el uso de IA no es un problema técnico, sino de honestidad, y erosiona la confianza en documentos que valen precisamente por esa confianza.</w:t>
       </w:r>
     </w:p>
     <w:p>
@@ -837,6 +942,49 @@
       <w:r>
         <w:rPr>
           <w:rFonts w:ascii="Arial" w:cs="Arial" w:eastAsia="Arial" w:hAnsi="Arial"/>
+          <w:b/>
+          <w:bCs/>
+          <w:sz w:val="24"/>
+          <w:szCs w:val="24"/>
+        </w:rPr>
+        <w:t xml:space="preserve">Actores, beneficios y riesgos.</w:t>
+      </w:r>
+      <w:r>
+        <w:rPr>
+          <w:rFonts w:ascii="Arial" w:cs="Arial" w:eastAsia="Arial" w:hAnsi="Arial"/>
+          <w:sz w:val="24"/>
+          <w:szCs w:val="24"/>
+        </w:rPr>
+        <w:t xml:space="preserve"> Son actores el personal administrativo y técnico, la dirección y las áreas de capacitación. El beneficio es disponer de tiempo para tareas de mayor valor; los riesgos, una mayor carga de trabajo y la pérdida gradual de capacidades humanas (</w:t>
+      </w:r>
+      <w:r>
+        <w:rPr>
+          <w:rFonts w:ascii="Arial" w:cs="Arial" w:eastAsia="Arial" w:hAnsi="Arial"/>
+          <w:i/>
+          <w:iCs/>
+          <w:sz w:val="24"/>
+          <w:szCs w:val="24"/>
+        </w:rPr>
+        <w:t xml:space="preserve">deskilling</w:t>
+      </w:r>
+      <w:r>
+        <w:rPr>
+          <w:rFonts w:ascii="Arial" w:cs="Arial" w:eastAsia="Arial" w:hAnsi="Arial"/>
+          <w:sz w:val="24"/>
+          <w:szCs w:val="24"/>
+        </w:rPr>
+        <w:t xml:space="preserve">). Degli-Esposti (2023) incluye esta pérdida entre los problemas que debe atender la ética de la IA y recuerda que el primer requisito de una IA confiable es que no sustituya a las personas, sino que les permita tomar decisiones informadas.</w:t>
+      </w:r>
+    </w:p>
+    <w:p>
+      <w:pPr>
+        <w:spacing w:after="0" w:before="0" w:line="360" w:lineRule="auto"/>
+        <w:ind w:firstLine="720"/>
+        <w:jc w:val="both"/>
+      </w:pPr>
+      <w:r>
+        <w:rPr>
+          <w:rFonts w:ascii="Arial" w:cs="Arial" w:eastAsia="Arial" w:hAnsi="Arial"/>
           <w:sz w:val="24"/>
           <w:szCs w:val="24"/>
         </w:rPr>
@@ -859,22 +1007,111 @@
           <w:sz w:val="24"/>
           <w:szCs w:val="24"/>
         </w:rPr>
-        <w:t xml:space="preserve">Mi perspectiva: cinco compromisos para un uso responsable</w:t>
-      </w:r>
-    </w:p>
-    <w:p>
-      <w:pPr>
-        <w:spacing w:after="0" w:before="0" w:line="360" w:lineRule="auto"/>
-        <w:ind w:firstLine="720"/>
-        <w:jc w:val="both"/>
-      </w:pPr>
-      <w:r>
-        <w:rPr>
-          <w:rFonts w:ascii="Arial" w:cs="Arial" w:eastAsia="Arial" w:hAnsi="Arial"/>
-          <w:sz w:val="24"/>
-          <w:szCs w:val="24"/>
-        </w:rPr>
-        <w:t xml:space="preserve">Propongo cinco compromisos para el uso de la IA y la automatización en los procesos académicos del CIESS:</w:t>
+        <w:t xml:space="preserve">Quinto dilema: equidad y sesgo, una mirada prospectiva</w:t>
+      </w:r>
+    </w:p>
+    <w:p>
+      <w:pPr>
+        <w:spacing w:after="0" w:before="0" w:line="360" w:lineRule="auto"/>
+        <w:ind w:firstLine="720"/>
+        <w:jc w:val="both"/>
+      </w:pPr>
+      <w:r>
+        <w:rPr>
+          <w:rFonts w:ascii="Arial" w:cs="Arial" w:eastAsia="Arial" w:hAnsi="Arial"/>
+          <w:sz w:val="24"/>
+          <w:szCs w:val="24"/>
+        </w:rPr>
+        <w:t xml:space="preserve">Este dilema aún no se materializa en el CIESS, pero conviene anticiparlo, porque los usos de los datos y de la IA que se están explorando pueden afectar el acceso de las personas a los servicios de la institución. Lo ilustran mi propuesta de un asistente virtual para el sitio institucional, que atendería consultas en español, portugués e inglés, y los tableros que ya distinguen la participación por país y por actividad. Si algún día modelos de este tipo se usaran para priorizar solicitudes de becas, recomendar actividades o responder consultas, aparecería el problema del sesgo.</w:t>
+      </w:r>
+    </w:p>
+    <w:p>
+      <w:pPr>
+        <w:spacing w:after="0" w:before="0" w:line="360" w:lineRule="auto"/>
+        <w:ind w:firstLine="720"/>
+        <w:jc w:val="both"/>
+      </w:pPr>
+      <w:r>
+        <w:rPr>
+          <w:rFonts w:ascii="Arial" w:cs="Arial" w:eastAsia="Arial" w:hAnsi="Arial"/>
+          <w:sz w:val="24"/>
+          <w:szCs w:val="24"/>
+        </w:rPr>
+        <w:t xml:space="preserve">Coeckelbergh (2021) señala que el sesgo es un problema ético y social propio de la ciencia de datos basada en IA: cuando un sistema toma o recomienda decisiones, estas pueden resultar injustas o poco equitativas para ciertos individuos o grupos, y a menudo no es intencionado, pues quienes desarrollan, usan o dirigen estos sistemas no prevén sus efectos discriminatorios. Degli-Esposti (2023) añade que el sesgo no depende solo de datos deficientes, sino también de los valores incorporados en los algoritmos, y que una IA confiable no debe reproducir prejuicios sociales que marginen a grupos vulnerables, sino ser accesible para todas las personas.</w:t>
+      </w:r>
+    </w:p>
+    <w:p>
+      <w:pPr>
+        <w:spacing w:after="0" w:before="0" w:line="360" w:lineRule="auto"/>
+        <w:ind w:firstLine="720"/>
+        <w:jc w:val="both"/>
+      </w:pPr>
+      <w:r>
+        <w:rPr>
+          <w:rFonts w:ascii="Arial" w:cs="Arial" w:eastAsia="Arial" w:hAnsi="Arial"/>
+          <w:b/>
+          <w:bCs/>
+          <w:sz w:val="24"/>
+          <w:szCs w:val="24"/>
+        </w:rPr>
+        <w:t xml:space="preserve">Actores, beneficios y riesgos.</w:t>
+      </w:r>
+      <w:r>
+        <w:rPr>
+          <w:rFonts w:ascii="Arial" w:cs="Arial" w:eastAsia="Arial" w:hAnsi="Arial"/>
+          <w:sz w:val="24"/>
+          <w:szCs w:val="24"/>
+        </w:rPr>
+        <w:t xml:space="preserve"> Los actores son los aspirantes y participantes de distintos países, las personas con diferentes idiomas o discapacidades, los comités académicos y quienes desarrollamos los sistemas. El beneficio sería ampliar la atención y apoyar las decisiones con más información; el riesgo, desfavorecer a ciertos países, idiomas o perfiles, lo que contradiría la sensibilidad a la diversidad que el CIESS reconoce entre sus valores (CIESS, s.f.-d).</w:t>
+      </w:r>
+    </w:p>
+    <w:p>
+      <w:pPr>
+        <w:spacing w:after="0" w:before="0" w:line="360" w:lineRule="auto"/>
+        <w:ind w:firstLine="720"/>
+        <w:jc w:val="both"/>
+      </w:pPr>
+      <w:r>
+        <w:rPr>
+          <w:rFonts w:ascii="Arial" w:cs="Arial" w:eastAsia="Arial" w:hAnsi="Arial"/>
+          <w:sz w:val="24"/>
+          <w:szCs w:val="24"/>
+        </w:rPr>
+        <w:t xml:space="preserve">Mi postura es que ningún sistema debería decidir por sí solo quién accede a una beca o a un programa. Antes de usar analítica o IA en procesos que afecten el acceso a servicios, propongo revisar sus resultados por país, idioma y condición de accesibilidad, mantener la decisión final en personas y comités, y diseñar con criterios de accesibilidad, como ya lo hago en el sitio institucional.</w:t>
+      </w:r>
+    </w:p>
+    <w:p>
+      <w:pPr>
+        <w:pStyle w:val="Heading2"/>
+        <w:keepNext/>
+        <w:spacing w:after="0" w:before="0" w:line="360" w:lineRule="auto"/>
+        <w:jc w:val="left"/>
+      </w:pPr>
+      <w:r>
+        <w:rPr>
+          <w:rFonts w:ascii="Arial" w:cs="Arial" w:eastAsia="Arial" w:hAnsi="Arial"/>
+          <w:b/>
+          <w:bCs/>
+          <w:color w:val="000000"/>
+          <w:sz w:val="24"/>
+          <w:szCs w:val="24"/>
+        </w:rPr>
+        <w:t xml:space="preserve">Propuesta de mitigación: seis compromisos para un uso responsable</w:t>
+      </w:r>
+    </w:p>
+    <w:p>
+      <w:pPr>
+        <w:spacing w:after="0" w:before="0" w:line="360" w:lineRule="auto"/>
+        <w:ind w:firstLine="720"/>
+        <w:jc w:val="both"/>
+      </w:pPr>
+      <w:r>
+        <w:rPr>
+          <w:rFonts w:ascii="Arial" w:cs="Arial" w:eastAsia="Arial" w:hAnsi="Arial"/>
+          <w:sz w:val="24"/>
+          <w:szCs w:val="24"/>
+        </w:rPr>
+        <w:t xml:space="preserve">Propongo seis compromisos para el uso de la IA y la automatización en los procesos académicos del CIESS:</w:t>
       </w:r>
     </w:p>
     <w:p>
@@ -961,7 +1198,7 @@
           <w:sz w:val="24"/>
           <w:szCs w:val="24"/>
         </w:rPr>
-        <w:t xml:space="preserve"> No entregar datos personales reales a herramientas externas, evitar copias intermedias y mantener un aviso de privacidad actualizado.</w:t>
+        <w:t xml:space="preserve"> No entregar datos personales reales a herramientas externas, evitar copias intermedias, publicar solo información agregada y mantener un aviso de privacidad actualizado.</w:t>
       </w:r>
     </w:p>
     <w:p>
@@ -1011,6 +1248,35 @@
           <w:sz w:val="24"/>
           <w:szCs w:val="24"/>
         </w:rPr>
+        <w:t xml:space="preserve">Equidad verificable.</w:t>
+      </w:r>
+      <w:r>
+        <w:rPr>
+          <w:rFonts w:ascii="Arial" w:cs="Arial" w:eastAsia="Arial" w:hAnsi="Arial"/>
+          <w:sz w:val="24"/>
+          <w:szCs w:val="24"/>
+        </w:rPr>
+        <w:t xml:space="preserve"> Revisar por país, idioma y accesibilidad los resultados de cualquier sistema que afecte el acceso a servicios, y dejar la decisión final a personas (Coeckelbergh, 2021; Degli-Esposti, 2023).</w:t>
+      </w:r>
+    </w:p>
+    <w:p>
+      <w:pPr>
+        <w:pStyle w:val="ListParagraph"/>
+        <w:numPr>
+          <w:ilvl w:val="0"/>
+          <w:numId w:val="2"/>
+        </w:numPr>
+        <w:spacing w:after="0" w:before="0" w:line="360" w:lineRule="auto"/>
+        <w:jc w:val="both"/>
+      </w:pPr>
+      <w:r>
+        <w:rPr>
+          <w:rFonts w:ascii="Arial" w:cs="Arial" w:eastAsia="Arial" w:hAnsi="Arial"/>
+          <w:b/>
+          <w:bCs/>
+          <w:sz w:val="24"/>
+          <w:szCs w:val="24"/>
+        </w:rPr>
         <w:t xml:space="preserve">Formación y transparencia.</w:t>
       </w:r>
       <w:r>
@@ -1038,22 +1304,22 @@
           <w:sz w:val="24"/>
           <w:szCs w:val="24"/>
         </w:rPr>
-        <w:t xml:space="preserve">Reflexión final</w:t>
-      </w:r>
-    </w:p>
-    <w:p>
-      <w:pPr>
-        <w:spacing w:after="0" w:before="0" w:line="360" w:lineRule="auto"/>
-        <w:ind w:firstLine="720"/>
-        <w:jc w:val="both"/>
-      </w:pPr>
-      <w:r>
-        <w:rPr>
-          <w:rFonts w:ascii="Arial" w:cs="Arial" w:eastAsia="Arial" w:hAnsi="Arial"/>
-          <w:sz w:val="24"/>
-          <w:szCs w:val="24"/>
-        </w:rPr>
-        <w:t xml:space="preserve">La IA y la ciencia de datos ofrecen al CIESS una oportunidad real de atender a más personas con mayor calidad, pero no modifican una verdad básica: la herramienta no es un agente moral, y quien la diseña, la configura y la usa conserva la responsabilidad de sus resultados (Coeckelbergh, 2021; Serafim et al., 2024). Quienes diseñamos, desarrollamos y usamos estos sistemas estamos, como señala Degli-Esposti (2023), en la primera línea de la ética de la IA. Mi experiencia desarrollando estos sistemas me enseñó que los riesgos más serios surgen al confiar en la tecnología sin verificarla, al compartir datos sin medir las consecuencias y al no dejar rastro de lo que se hizo. Por eso la ética no frena la innovación: es lo que permite que documentos como las constancias y las actas sigan valiendo. Una institución que enseña a otras a usar la IA con responsabilidad debe ser la primera en practicarlo.</w:t>
+        <w:t xml:space="preserve">Postura personal y reflexión final</w:t>
+      </w:r>
+    </w:p>
+    <w:p>
+      <w:pPr>
+        <w:spacing w:after="0" w:before="0" w:line="360" w:lineRule="auto"/>
+        <w:ind w:firstLine="720"/>
+        <w:jc w:val="both"/>
+      </w:pPr>
+      <w:r>
+        <w:rPr>
+          <w:rFonts w:ascii="Arial" w:cs="Arial" w:eastAsia="Arial" w:hAnsi="Arial"/>
+          <w:sz w:val="24"/>
+          <w:szCs w:val="24"/>
+        </w:rPr>
+        <w:t xml:space="preserve">La IA y la ciencia de datos ofrecen al CIESS una oportunidad real de atender a más personas con mayor calidad, pero no modifican una verdad básica: la herramienta no es un agente moral, y quien la diseña, la configura y la usa conserva la responsabilidad de sus resultados (Coeckelbergh, 2021; Serafim et al., 2024). Quienes diseñamos, desarrollamos y usamos estos sistemas estamos, como señala Degli-Esposti (2023), en la primera línea de la ética de la IA. Mi experiencia desarrollando estos sistemas me enseñó que los riesgos más serios surgen al confiar en la tecnología sin verificarla, al compartir datos sin medir las consecuencias, al no dejar rastro de lo que se hizo y al olvidar a quienes podrían quedar fuera. Por eso la ética no frena la innovación: es lo que permite que documentos como las constancias y las actas sigan valiendo, y que los futuros asistentes y análisis de datos sirvan a todas las personas por igual. Una institución que enseña a otras a usar la IA con responsabilidad debe ser la primera en practicarlo.</w:t>
       </w:r>
     </w:p>
     <w:p>
@@ -1574,7 +1840,7 @@
         </w:rPr>
         <w:t xml:space="preserve">. Diario Oficial de la Federación. </w:t>
       </w:r>
-      <w:hyperlink w:history="1" r:id="rIdfilo7abusvj_d19yttfvv">
+      <w:hyperlink w:history="1" r:id="rId5ikqvifn1nkopik7mchox">
         <w:r>
           <w:rPr>
             <w:rStyle w:val="Hyperlink"/>
@@ -1618,7 +1884,7 @@
         </w:rPr>
         <w:t xml:space="preserve"> (pp. 2633-2650). USENIX Association. </w:t>
       </w:r>
-      <w:hyperlink w:history="1" r:id="rIdrwahcou7zwdbebxqi-39m">
+      <w:hyperlink w:history="1" r:id="rIdjwnjxvmuae78v4e6jl_ub">
         <w:r>
           <w:rPr>
             <w:rStyle w:val="Hyperlink"/>
@@ -1662,7 +1928,7 @@
         </w:rPr>
         <w:t xml:space="preserve">. </w:t>
       </w:r>
-      <w:hyperlink w:history="1" r:id="rIdhmndftgzdwzhg1mpdbxbo">
+      <w:hyperlink w:history="1" r:id="rIduohmyurxrj1zdkvfpkroe">
         <w:r>
           <w:rPr>
             <w:rStyle w:val="Hyperlink"/>
@@ -1706,7 +1972,7 @@
         </w:rPr>
         <w:t xml:space="preserve">. </w:t>
       </w:r>
-      <w:hyperlink w:history="1" r:id="rIdey2nkvmj6ubh3uourqf0f">
+      <w:hyperlink w:history="1" r:id="rIdj9karrzs6gagoxchrg9cg">
         <w:r>
           <w:rPr>
             <w:rStyle w:val="Hyperlink"/>
@@ -1750,7 +2016,7 @@
         </w:rPr>
         <w:t xml:space="preserve">. </w:t>
       </w:r>
-      <w:hyperlink w:history="1" r:id="rIda-c0ikvgycbwdsf5um7_g">
+      <w:hyperlink w:history="1" r:id="rIdl-yuoxq71o3nljlrra-d7">
         <w:r>
           <w:rPr>
             <w:rStyle w:val="Hyperlink"/>
@@ -1794,7 +2060,7 @@
         </w:rPr>
         <w:t xml:space="preserve">. </w:t>
       </w:r>
-      <w:hyperlink w:history="1" r:id="rIdot2a2q5pkvlc_ydy1avuu">
+      <w:hyperlink w:history="1" r:id="rIdywuflczz9qsevxumal-13">
         <w:r>
           <w:rPr>
             <w:rStyle w:val="Hyperlink"/>
@@ -1904,7 +2170,7 @@
         </w:rPr>
         <w:t xml:space="preserve">, 40-60. </w:t>
       </w:r>
-      <w:hyperlink w:history="1" r:id="rIdmbfr3vh6wkfxdsuw6nahp">
+      <w:hyperlink w:history="1" r:id="rIdxgefzpvkrdmf720twcuzc">
         <w:r>
           <w:rPr>
             <w:rStyle w:val="Hyperlink"/>
@@ -1948,7 +2214,7 @@
         </w:rPr>
         <w:t xml:space="preserve">(4), 689-707. </w:t>
       </w:r>
-      <w:hyperlink w:history="1" r:id="rId6yvhpbfhcgzsffhfw1gik">
+      <w:hyperlink w:history="1" r:id="rIdpfroadg70jmg-n3zaevgt">
         <w:r>
           <w:rPr>
             <w:rStyle w:val="Hyperlink"/>
@@ -1992,7 +2258,7 @@
         </w:rPr>
         <w:t xml:space="preserve"> (ILO Working Paper 96). International Labour Organization. </w:t>
       </w:r>
-      <w:hyperlink w:history="1" r:id="rId6khakckjh7om6s8-hzlu5">
+      <w:hyperlink w:history="1" r:id="rIdy_k2qy-znn99ev4wgvcg5">
         <w:r>
           <w:rPr>
             <w:rStyle w:val="Hyperlink"/>
@@ -2069,7 +2335,7 @@
         </w:rPr>
         <w:t xml:space="preserve"> (OECD/LEGAL/0449). OECD Legal Instruments. </w:t>
       </w:r>
-      <w:hyperlink w:history="1" r:id="rId-g_cmo31ywvtgahpij3sl">
+      <w:hyperlink w:history="1" r:id="rIdy148ccopvgf36bnacwrkz">
         <w:r>
           <w:rPr>
             <w:rStyle w:val="Hyperlink"/>
@@ -2113,7 +2379,7 @@
         </w:rPr>
         <w:t xml:space="preserve"> (SHS/BIO/PI/2021/1). </w:t>
       </w:r>
-      <w:hyperlink w:history="1" r:id="rId7ebd7mvfky66vouyhgc-c">
+      <w:hyperlink w:history="1" r:id="rId2mn9f5ddt_maunupyflcv">
         <w:r>
           <w:rPr>
             <w:rStyle w:val="Hyperlink"/>
@@ -2157,7 +2423,7 @@
         </w:rPr>
         <w:t xml:space="preserve">(3), 381-410. </w:t>
       </w:r>
-      <w:hyperlink w:history="1" r:id="rIddu8fqjz0tvgz2by-uuc89">
+      <w:hyperlink w:history="1" r:id="rIdqwfcqccgp1qraarzaezva">
         <w:r>
           <w:rPr>
             <w:rStyle w:val="Hyperlink"/>

</xml_diff>

<commit_message>
Tercera retroalimentación (Jorge) y nombres de los tres compañeros en las evidencias del ensayo
Co-Authored-By: Claude Sonnet 5.5 <noreply@anthropic.com>
Claude-Session: https://claude.ai/code/session_012HQtHGEWw83YL2w3UxYHZx
</commit_message>
<xml_diff>
--- a/maestria/Navarrete_Arturo_R2_U2.docx
+++ b/maestria/Navarrete_Arturo_R2_U2.docx
@@ -1502,7 +1502,7 @@
           <w:szCs w:val="24"/>
           <w:shd w:fill="FFFF00" w:color="auto" w:val="clear"/>
         </w:rPr>
-        <w:t xml:space="preserve">[nombre del compañero o compañera 1]</w:t>
+        <w:t xml:space="preserve">Dylan Tepatzi Xahuentitla</w:t>
       </w:r>
     </w:p>
     <w:tbl>
@@ -1600,7 +1600,7 @@
           <w:szCs w:val="24"/>
           <w:shd w:fill="FFFF00" w:color="auto" w:val="clear"/>
         </w:rPr>
-        <w:t xml:space="preserve">[nombre del compañero o compañera 2]</w:t>
+        <w:t xml:space="preserve">Uriel Antonio Torres Rojas</w:t>
       </w:r>
     </w:p>
     <w:tbl>
@@ -1698,7 +1698,7 @@
           <w:szCs w:val="24"/>
           <w:shd w:fill="FFFF00" w:color="auto" w:val="clear"/>
         </w:rPr>
-        <w:t xml:space="preserve">[nombre del compañero o compañera 3]</w:t>
+        <w:t xml:space="preserve">Jorge Semiel Hernández Santos</w:t>
       </w:r>
     </w:p>
     <w:tbl>
@@ -1840,7 +1840,7 @@
         </w:rPr>
         <w:t xml:space="preserve">. Diario Oficial de la Federación. </w:t>
       </w:r>
-      <w:hyperlink w:history="1" r:id="rId5ikqvifn1nkopik7mchox">
+      <w:hyperlink w:history="1" r:id="rIdi2hhmuqp7v1s8isruoezl">
         <w:r>
           <w:rPr>
             <w:rStyle w:val="Hyperlink"/>
@@ -1884,7 +1884,7 @@
         </w:rPr>
         <w:t xml:space="preserve"> (pp. 2633-2650). USENIX Association. </w:t>
       </w:r>
-      <w:hyperlink w:history="1" r:id="rIdjwnjxvmuae78v4e6jl_ub">
+      <w:hyperlink w:history="1" r:id="rIdshubrz8le0u6p1hzm0rfq">
         <w:r>
           <w:rPr>
             <w:rStyle w:val="Hyperlink"/>
@@ -1928,7 +1928,7 @@
         </w:rPr>
         <w:t xml:space="preserve">. </w:t>
       </w:r>
-      <w:hyperlink w:history="1" r:id="rIduohmyurxrj1zdkvfpkroe">
+      <w:hyperlink w:history="1" r:id="rIdjdpkqyxhpza3jn_inyuio">
         <w:r>
           <w:rPr>
             <w:rStyle w:val="Hyperlink"/>
@@ -1972,7 +1972,7 @@
         </w:rPr>
         <w:t xml:space="preserve">. </w:t>
       </w:r>
-      <w:hyperlink w:history="1" r:id="rIdj9karrzs6gagoxchrg9cg">
+      <w:hyperlink w:history="1" r:id="rIdpf50-zsjzbujd414krpzy">
         <w:r>
           <w:rPr>
             <w:rStyle w:val="Hyperlink"/>
@@ -2016,7 +2016,7 @@
         </w:rPr>
         <w:t xml:space="preserve">. </w:t>
       </w:r>
-      <w:hyperlink w:history="1" r:id="rIdl-yuoxq71o3nljlrra-d7">
+      <w:hyperlink w:history="1" r:id="rIdeqylaygrs2hhe0uo29m5d">
         <w:r>
           <w:rPr>
             <w:rStyle w:val="Hyperlink"/>
@@ -2060,7 +2060,7 @@
         </w:rPr>
         <w:t xml:space="preserve">. </w:t>
       </w:r>
-      <w:hyperlink w:history="1" r:id="rIdywuflczz9qsevxumal-13">
+      <w:hyperlink w:history="1" r:id="rIdsq3_zjnoo_eb6clczp0t-">
         <w:r>
           <w:rPr>
             <w:rStyle w:val="Hyperlink"/>
@@ -2170,7 +2170,7 @@
         </w:rPr>
         <w:t xml:space="preserve">, 40-60. </w:t>
       </w:r>
-      <w:hyperlink w:history="1" r:id="rIdxgefzpvkrdmf720twcuzc">
+      <w:hyperlink w:history="1" r:id="rIdv-rpnwxpifpi0ji675zji">
         <w:r>
           <w:rPr>
             <w:rStyle w:val="Hyperlink"/>
@@ -2214,7 +2214,7 @@
         </w:rPr>
         <w:t xml:space="preserve">(4), 689-707. </w:t>
       </w:r>
-      <w:hyperlink w:history="1" r:id="rIdpfroadg70jmg-n3zaevgt">
+      <w:hyperlink w:history="1" r:id="rIdtbwtx57ihutr0-j2pgozg">
         <w:r>
           <w:rPr>
             <w:rStyle w:val="Hyperlink"/>
@@ -2258,7 +2258,7 @@
         </w:rPr>
         <w:t xml:space="preserve"> (ILO Working Paper 96). International Labour Organization. </w:t>
       </w:r>
-      <w:hyperlink w:history="1" r:id="rIdy_k2qy-znn99ev4wgvcg5">
+      <w:hyperlink w:history="1" r:id="rIdadmhbqofnkn8yqlu63r5p">
         <w:r>
           <w:rPr>
             <w:rStyle w:val="Hyperlink"/>
@@ -2335,7 +2335,7 @@
         </w:rPr>
         <w:t xml:space="preserve"> (OECD/LEGAL/0449). OECD Legal Instruments. </w:t>
       </w:r>
-      <w:hyperlink w:history="1" r:id="rIdy148ccopvgf36bnacwrkz">
+      <w:hyperlink w:history="1" r:id="rIdzwswvlqpwvvblmho3arlq">
         <w:r>
           <w:rPr>
             <w:rStyle w:val="Hyperlink"/>
@@ -2379,7 +2379,7 @@
         </w:rPr>
         <w:t xml:space="preserve"> (SHS/BIO/PI/2021/1). </w:t>
       </w:r>
-      <w:hyperlink w:history="1" r:id="rId2mn9f5ddt_maunupyflcv">
+      <w:hyperlink w:history="1" r:id="rIdlhgtiu5jpvs-ljgztvgjy">
         <w:r>
           <w:rPr>
             <w:rStyle w:val="Hyperlink"/>
@@ -2423,7 +2423,7 @@
         </w:rPr>
         <w:t xml:space="preserve">(3), 381-410. </w:t>
       </w:r>
-      <w:hyperlink w:history="1" r:id="rIdqwfcqccgp1qraarzaezva">
+      <w:hyperlink w:history="1" r:id="rIdtfguwwk1xh5ywqhol6md3">
         <w:r>
           <w:rPr>
             <w:rStyle w:val="Hyperlink"/>

</xml_diff>